<commit_message>
Instalador MSI (Setup.exe y Edelstahl ERP.msi), su proyecto y manuales actualizados
</commit_message>
<xml_diff>
--- a/Documentacion/Manuales/Manual-de-usuario.docx
+++ b/Documentacion/Manuales/Manual-de-usuario.docx
@@ -164,7 +164,7 @@
         </w:numPr>
         <w:spacing w:before="15" w:after="15"/>
         <w:ind w:left="930"/>
-        <w:divId w:val="2040156259"/>
+        <w:divId w:val="430587021"/>
         <w:rPr>
           <w:rFonts w:ascii="Calibri" w:eastAsia="Times New Roman" w:hAnsi="Calibri" w:cs="Calibri"/>
           <w:color w:val="1C2430"/>
@@ -192,7 +192,7 @@
         </w:numPr>
         <w:spacing w:before="15" w:after="15"/>
         <w:ind w:left="1140"/>
-        <w:divId w:val="2040156259"/>
+        <w:divId w:val="430587021"/>
         <w:rPr>
           <w:rFonts w:ascii="Calibri" w:eastAsia="Times New Roman" w:hAnsi="Calibri" w:cs="Calibri"/>
           <w:color w:val="1C2430"/>
@@ -220,7 +220,7 @@
         </w:numPr>
         <w:spacing w:before="15" w:after="15"/>
         <w:ind w:left="1140"/>
-        <w:divId w:val="2040156259"/>
+        <w:divId w:val="430587021"/>
         <w:rPr>
           <w:rFonts w:ascii="Calibri" w:eastAsia="Times New Roman" w:hAnsi="Calibri" w:cs="Calibri"/>
           <w:color w:val="1C2430"/>
@@ -248,7 +248,7 @@
         </w:numPr>
         <w:spacing w:before="15" w:after="15"/>
         <w:ind w:left="1140"/>
-        <w:divId w:val="2040156259"/>
+        <w:divId w:val="430587021"/>
         <w:rPr>
           <w:rFonts w:ascii="Calibri" w:eastAsia="Times New Roman" w:hAnsi="Calibri" w:cs="Calibri"/>
           <w:color w:val="1C2430"/>
@@ -276,7 +276,7 @@
         </w:numPr>
         <w:spacing w:before="15" w:after="15"/>
         <w:ind w:left="930"/>
-        <w:divId w:val="2040156259"/>
+        <w:divId w:val="430587021"/>
         <w:rPr>
           <w:rFonts w:ascii="Calibri" w:eastAsia="Times New Roman" w:hAnsi="Calibri" w:cs="Calibri"/>
           <w:color w:val="1C2430"/>
@@ -304,7 +304,7 @@
         </w:numPr>
         <w:spacing w:before="15" w:after="15"/>
         <w:ind w:left="1140"/>
-        <w:divId w:val="2040156259"/>
+        <w:divId w:val="430587021"/>
         <w:rPr>
           <w:rFonts w:ascii="Calibri" w:eastAsia="Times New Roman" w:hAnsi="Calibri" w:cs="Calibri"/>
           <w:color w:val="1C2430"/>
@@ -332,7 +332,7 @@
         </w:numPr>
         <w:spacing w:before="15" w:after="15"/>
         <w:ind w:left="1140"/>
-        <w:divId w:val="2040156259"/>
+        <w:divId w:val="430587021"/>
         <w:rPr>
           <w:rFonts w:ascii="Calibri" w:eastAsia="Times New Roman" w:hAnsi="Calibri" w:cs="Calibri"/>
           <w:color w:val="1C2430"/>
@@ -360,7 +360,7 @@
         </w:numPr>
         <w:spacing w:before="15" w:after="15"/>
         <w:ind w:left="1140"/>
-        <w:divId w:val="2040156259"/>
+        <w:divId w:val="430587021"/>
         <w:rPr>
           <w:rFonts w:ascii="Calibri" w:eastAsia="Times New Roman" w:hAnsi="Calibri" w:cs="Calibri"/>
           <w:color w:val="1C2430"/>
@@ -388,7 +388,7 @@
         </w:numPr>
         <w:spacing w:before="15" w:after="15"/>
         <w:ind w:left="1140"/>
-        <w:divId w:val="2040156259"/>
+        <w:divId w:val="430587021"/>
         <w:rPr>
           <w:rFonts w:ascii="Calibri" w:eastAsia="Times New Roman" w:hAnsi="Calibri" w:cs="Calibri"/>
           <w:color w:val="1C2430"/>
@@ -416,7 +416,7 @@
         </w:numPr>
         <w:spacing w:before="15" w:after="15"/>
         <w:ind w:left="1140"/>
-        <w:divId w:val="2040156259"/>
+        <w:divId w:val="430587021"/>
         <w:rPr>
           <w:rFonts w:ascii="Calibri" w:eastAsia="Times New Roman" w:hAnsi="Calibri" w:cs="Calibri"/>
           <w:color w:val="1C2430"/>
@@ -444,7 +444,7 @@
         </w:numPr>
         <w:spacing w:before="15" w:after="15"/>
         <w:ind w:left="1140"/>
-        <w:divId w:val="2040156259"/>
+        <w:divId w:val="430587021"/>
         <w:rPr>
           <w:rFonts w:ascii="Calibri" w:eastAsia="Times New Roman" w:hAnsi="Calibri" w:cs="Calibri"/>
           <w:color w:val="1C2430"/>
@@ -472,7 +472,7 @@
         </w:numPr>
         <w:spacing w:before="15" w:after="15"/>
         <w:ind w:left="1140"/>
-        <w:divId w:val="2040156259"/>
+        <w:divId w:val="430587021"/>
         <w:rPr>
           <w:rFonts w:ascii="Calibri" w:eastAsia="Times New Roman" w:hAnsi="Calibri" w:cs="Calibri"/>
           <w:color w:val="1C2430"/>
@@ -500,7 +500,7 @@
         </w:numPr>
         <w:spacing w:before="15" w:after="15"/>
         <w:ind w:left="1140"/>
-        <w:divId w:val="2040156259"/>
+        <w:divId w:val="430587021"/>
         <w:rPr>
           <w:rFonts w:ascii="Calibri" w:eastAsia="Times New Roman" w:hAnsi="Calibri" w:cs="Calibri"/>
           <w:color w:val="1C2430"/>
@@ -528,7 +528,7 @@
         </w:numPr>
         <w:spacing w:before="15" w:after="15"/>
         <w:ind w:left="1140"/>
-        <w:divId w:val="2040156259"/>
+        <w:divId w:val="430587021"/>
         <w:rPr>
           <w:rFonts w:ascii="Calibri" w:eastAsia="Times New Roman" w:hAnsi="Calibri" w:cs="Calibri"/>
           <w:color w:val="1C2430"/>
@@ -556,7 +556,7 @@
         </w:numPr>
         <w:spacing w:before="15" w:after="15"/>
         <w:ind w:left="1140"/>
-        <w:divId w:val="2040156259"/>
+        <w:divId w:val="430587021"/>
         <w:rPr>
           <w:rFonts w:ascii="Calibri" w:eastAsia="Times New Roman" w:hAnsi="Calibri" w:cs="Calibri"/>
           <w:color w:val="1C2430"/>
@@ -584,7 +584,7 @@
         </w:numPr>
         <w:spacing w:before="15" w:after="15"/>
         <w:ind w:left="930"/>
-        <w:divId w:val="2040156259"/>
+        <w:divId w:val="430587021"/>
         <w:rPr>
           <w:rFonts w:ascii="Calibri" w:eastAsia="Times New Roman" w:hAnsi="Calibri" w:cs="Calibri"/>
           <w:color w:val="1C2430"/>
@@ -1593,7 +1593,7 @@
     <w:p>
       <w:pPr>
         <w:shd w:val="clear" w:color="auto" w:fill="FFF8E1"/>
-        <w:divId w:val="1050493806"/>
+        <w:divId w:val="1737704748"/>
         <w:rPr>
           <w:rFonts w:ascii="Calibri" w:eastAsia="Times New Roman" w:hAnsi="Calibri" w:cs="Calibri"/>
           <w:color w:val="1C2430"/>
@@ -1855,7 +1855,7 @@
           <w:szCs w:val="22"/>
         </w:rPr>
         <w:drawing>
-          <wp:inline distT="0" distB="0" distL="0" distR="0" wp14:anchorId="18F87D2B" wp14:editId="0FE68808">
+          <wp:inline distT="0" distB="0" distL="0" distR="0" wp14:anchorId="36E37892" wp14:editId="4F9555F3">
             <wp:extent cx="18249900" cy="9620250"/>
             <wp:effectExtent l="0" t="0" r="0" b="0"/>
             <wp:docPr id="1" name="Picture 1"/>
@@ -2029,7 +2029,7 @@
     <w:p>
       <w:pPr>
         <w:shd w:val="clear" w:color="auto" w:fill="FDECEC"/>
-        <w:divId w:val="444010441"/>
+        <w:divId w:val="44255200"/>
         <w:rPr>
           <w:rFonts w:ascii="Calibri" w:eastAsia="Times New Roman" w:hAnsi="Calibri" w:cs="Calibri"/>
           <w:color w:val="1C2430"/>
@@ -2243,7 +2243,7 @@
           <w:szCs w:val="22"/>
         </w:rPr>
         <w:drawing>
-          <wp:inline distT="0" distB="0" distL="0" distR="0" wp14:anchorId="19FD513B" wp14:editId="2622125C">
+          <wp:inline distT="0" distB="0" distL="0" distR="0" wp14:anchorId="2F0F2E1C" wp14:editId="7468B20C">
             <wp:extent cx="14287500" cy="8191500"/>
             <wp:effectExtent l="0" t="0" r="0" b="0"/>
             <wp:docPr id="2" name="Picture 2"/>
@@ -2573,7 +2573,7 @@
           <w:szCs w:val="22"/>
         </w:rPr>
         <w:drawing>
-          <wp:inline distT="0" distB="0" distL="0" distR="0" wp14:anchorId="042729AB" wp14:editId="6D763B38">
+          <wp:inline distT="0" distB="0" distL="0" distR="0" wp14:anchorId="6F837A4E" wp14:editId="21F7FD98">
             <wp:extent cx="14287500" cy="8191500"/>
             <wp:effectExtent l="0" t="0" r="0" b="0"/>
             <wp:docPr id="3" name="Picture 3"/>
@@ -2893,7 +2893,7 @@
           <w:szCs w:val="22"/>
         </w:rPr>
         <w:drawing>
-          <wp:inline distT="0" distB="0" distL="0" distR="0" wp14:anchorId="6BCAB2BA" wp14:editId="5A376C40">
+          <wp:inline distT="0" distB="0" distL="0" distR="0" wp14:anchorId="41C8826A" wp14:editId="44400050">
             <wp:extent cx="14287500" cy="8191500"/>
             <wp:effectExtent l="0" t="0" r="0" b="0"/>
             <wp:docPr id="4" name="Picture 4"/>
@@ -3637,7 +3637,7 @@
     <w:p>
       <w:pPr>
         <w:shd w:val="clear" w:color="auto" w:fill="FFF8E1"/>
-        <w:divId w:val="178199392"/>
+        <w:divId w:val="1851722738"/>
         <w:rPr>
           <w:rFonts w:ascii="Calibri" w:eastAsia="Times New Roman" w:hAnsi="Calibri" w:cs="Calibri"/>
           <w:color w:val="1C2430"/>
@@ -3698,7 +3698,7 @@
           <w:szCs w:val="22"/>
         </w:rPr>
         <w:drawing>
-          <wp:inline distT="0" distB="0" distL="0" distR="0" wp14:anchorId="1B40B5A2" wp14:editId="1C84CE49">
+          <wp:inline distT="0" distB="0" distL="0" distR="0" wp14:anchorId="6658D4CD" wp14:editId="78E8B135">
             <wp:extent cx="14287500" cy="8191500"/>
             <wp:effectExtent l="0" t="0" r="0" b="0"/>
             <wp:docPr id="5" name="Picture 5"/>
@@ -4026,7 +4026,7 @@
     <w:p>
       <w:pPr>
         <w:shd w:val="clear" w:color="auto" w:fill="FDECEC"/>
-        <w:divId w:val="720397351"/>
+        <w:divId w:val="646668693"/>
         <w:rPr>
           <w:rFonts w:ascii="Calibri" w:eastAsia="Times New Roman" w:hAnsi="Calibri" w:cs="Calibri"/>
           <w:color w:val="1C2430"/>
@@ -4431,7 +4431,7 @@
           <w:szCs w:val="22"/>
         </w:rPr>
         <w:drawing>
-          <wp:inline distT="0" distB="0" distL="0" distR="0" wp14:anchorId="2DEA9678" wp14:editId="1B9B4C2B">
+          <wp:inline distT="0" distB="0" distL="0" distR="0" wp14:anchorId="11E33E4F" wp14:editId="55DA2082">
             <wp:extent cx="14287500" cy="8191500"/>
             <wp:effectExtent l="0" t="0" r="0" b="0"/>
             <wp:docPr id="6" name="Picture 6"/>
@@ -4613,7 +4613,7 @@
           <w:szCs w:val="22"/>
         </w:rPr>
         <w:drawing>
-          <wp:inline distT="0" distB="0" distL="0" distR="0" wp14:anchorId="2FC5C78B" wp14:editId="5184E2A2">
+          <wp:inline distT="0" distB="0" distL="0" distR="0" wp14:anchorId="2C1E03D4" wp14:editId="1685A560">
             <wp:extent cx="14287500" cy="8191500"/>
             <wp:effectExtent l="0" t="0" r="0" b="0"/>
             <wp:docPr id="7" name="Picture 7"/>
@@ -5014,7 +5014,7 @@
     <w:p>
       <w:pPr>
         <w:shd w:val="clear" w:color="auto" w:fill="FFF8E1"/>
-        <w:divId w:val="1612204456"/>
+        <w:divId w:val="1087926661"/>
         <w:rPr>
           <w:rFonts w:ascii="Calibri" w:eastAsia="Times New Roman" w:hAnsi="Calibri" w:cs="Calibri"/>
           <w:color w:val="1C2430"/>
@@ -5175,7 +5175,7 @@
           <w:szCs w:val="22"/>
         </w:rPr>
         <w:drawing>
-          <wp:inline distT="0" distB="0" distL="0" distR="0" wp14:anchorId="71F73119" wp14:editId="33237A87">
+          <wp:inline distT="0" distB="0" distL="0" distR="0" wp14:anchorId="202600AF" wp14:editId="6CF504E0">
             <wp:extent cx="5686425" cy="4705350"/>
             <wp:effectExtent l="0" t="0" r="9525" b="0"/>
             <wp:docPr id="8" name="Picture 8"/>
@@ -5859,7 +5859,7 @@
           <w:szCs w:val="22"/>
         </w:rPr>
         <w:drawing>
-          <wp:inline distT="0" distB="0" distL="0" distR="0" wp14:anchorId="73205CFD" wp14:editId="3B9C4ED8">
+          <wp:inline distT="0" distB="0" distL="0" distR="0" wp14:anchorId="0EC8F446" wp14:editId="4E4FCE50">
             <wp:extent cx="18021300" cy="10001250"/>
             <wp:effectExtent l="0" t="0" r="0" b="0"/>
             <wp:docPr id="9" name="Picture 9"/>
@@ -6193,7 +6193,7 @@
           <w:szCs w:val="22"/>
         </w:rPr>
         <w:drawing>
-          <wp:inline distT="0" distB="0" distL="0" distR="0" wp14:anchorId="768994E6" wp14:editId="172232FE">
+          <wp:inline distT="0" distB="0" distL="0" distR="0" wp14:anchorId="66AAA555" wp14:editId="3B9598A7">
             <wp:extent cx="18230850" cy="10144125"/>
             <wp:effectExtent l="0" t="0" r="0" b="9525"/>
             <wp:docPr id="10" name="Picture 10"/>
@@ -6272,7 +6272,7 @@
     <w:p>
       <w:pPr>
         <w:shd w:val="clear" w:color="auto" w:fill="FDECEC"/>
-        <w:divId w:val="513954732"/>
+        <w:divId w:val="1751854191"/>
         <w:rPr>
           <w:rFonts w:ascii="Calibri" w:eastAsia="Times New Roman" w:hAnsi="Calibri" w:cs="Calibri"/>
           <w:color w:val="1C2430"/>
@@ -6339,7 +6339,7 @@
           <w:szCs w:val="22"/>
         </w:rPr>
         <w:drawing>
-          <wp:inline distT="0" distB="0" distL="0" distR="0" wp14:anchorId="160B026F" wp14:editId="3F690CBA">
+          <wp:inline distT="0" distB="0" distL="0" distR="0" wp14:anchorId="750E1249" wp14:editId="37E06FA2">
             <wp:extent cx="17716500" cy="10248900"/>
             <wp:effectExtent l="0" t="0" r="0" b="0"/>
             <wp:docPr id="11" name="Picture 11"/>
@@ -6696,7 +6696,7 @@
           <w:szCs w:val="22"/>
         </w:rPr>
         <w:drawing>
-          <wp:inline distT="0" distB="0" distL="0" distR="0" wp14:anchorId="3C1A2273" wp14:editId="51A85850">
+          <wp:inline distT="0" distB="0" distL="0" distR="0" wp14:anchorId="38277018" wp14:editId="5C04252E">
             <wp:extent cx="14287500" cy="8191500"/>
             <wp:effectExtent l="0" t="0" r="0" b="0"/>
             <wp:docPr id="12" name="Picture 12"/>
@@ -6944,7 +6944,7 @@
     <w:p>
       <w:pPr>
         <w:shd w:val="clear" w:color="auto" w:fill="FDECEC"/>
-        <w:divId w:val="2082872316"/>
+        <w:divId w:val="1140197274"/>
         <w:rPr>
           <w:rFonts w:ascii="Calibri" w:eastAsia="Times New Roman" w:hAnsi="Calibri" w:cs="Calibri"/>
           <w:color w:val="1C2430"/>
@@ -7506,7 +7506,7 @@
           <w:szCs w:val="22"/>
         </w:rPr>
         <w:drawing>
-          <wp:inline distT="0" distB="0" distL="0" distR="0" wp14:anchorId="4250DA4A" wp14:editId="32D331EF">
+          <wp:inline distT="0" distB="0" distL="0" distR="0" wp14:anchorId="26133519" wp14:editId="49E8BC53">
             <wp:extent cx="14287500" cy="8191500"/>
             <wp:effectExtent l="0" t="0" r="0" b="0"/>
             <wp:docPr id="13" name="Picture 13"/>
@@ -7967,7 +7967,7 @@
           <w:szCs w:val="22"/>
         </w:rPr>
         <w:drawing>
-          <wp:inline distT="0" distB="0" distL="0" distR="0" wp14:anchorId="6B2F6AA0" wp14:editId="151A5CEF">
+          <wp:inline distT="0" distB="0" distL="0" distR="0" wp14:anchorId="008D977E" wp14:editId="52F9805C">
             <wp:extent cx="14287500" cy="8191500"/>
             <wp:effectExtent l="0" t="0" r="0" b="0"/>
             <wp:docPr id="14" name="Picture 14"/>
@@ -8212,7 +8212,7 @@
           <w:szCs w:val="22"/>
         </w:rPr>
         <w:drawing>
-          <wp:inline distT="0" distB="0" distL="0" distR="0" wp14:anchorId="2F6C0A60" wp14:editId="5ED6DEA3">
+          <wp:inline distT="0" distB="0" distL="0" distR="0" wp14:anchorId="48BE1D1E" wp14:editId="406FE915">
             <wp:extent cx="14287500" cy="8191500"/>
             <wp:effectExtent l="0" t="0" r="0" b="0"/>
             <wp:docPr id="15" name="Picture 15"/>
@@ -8648,7 +8648,7 @@
           <w:szCs w:val="22"/>
         </w:rPr>
         <w:drawing>
-          <wp:inline distT="0" distB="0" distL="0" distR="0" wp14:anchorId="74280447" wp14:editId="3E391BAB">
+          <wp:inline distT="0" distB="0" distL="0" distR="0" wp14:anchorId="204D94A9" wp14:editId="5B4CDC8D">
             <wp:extent cx="14287500" cy="8191500"/>
             <wp:effectExtent l="0" t="0" r="0" b="0"/>
             <wp:docPr id="16" name="Picture 16"/>
@@ -8787,7 +8787,7 @@
           <w:szCs w:val="22"/>
         </w:rPr>
         <w:drawing>
-          <wp:inline distT="0" distB="0" distL="0" distR="0" wp14:anchorId="2FE73CF9" wp14:editId="551AEBBB">
+          <wp:inline distT="0" distB="0" distL="0" distR="0" wp14:anchorId="2EB6002A" wp14:editId="1731172A">
             <wp:extent cx="18278475" cy="10277475"/>
             <wp:effectExtent l="0" t="0" r="9525" b="9525"/>
             <wp:docPr id="17" name="Picture 17"/>
@@ -9060,7 +9060,7 @@
     <w:p>
       <w:pPr>
         <w:shd w:val="clear" w:color="auto" w:fill="FDECEC"/>
-        <w:divId w:val="507673792"/>
+        <w:divId w:val="1835880525"/>
         <w:rPr>
           <w:rFonts w:ascii="Calibri" w:eastAsia="Times New Roman" w:hAnsi="Calibri" w:cs="Calibri"/>
           <w:color w:val="1C2430"/>
@@ -10339,9 +10339,9 @@
 <file path=word/numbering.xml><?xml version="1.0" encoding="utf-8"?>
 <w:numbering xmlns:wpc="http://schemas.microsoft.com/office/word/2010/wordprocessingCanvas" xmlns:cx="http://schemas.microsoft.com/office/drawing/2014/chartex" xmlns:cx1="http://schemas.microsoft.com/office/drawing/2015/9/8/chartex" xmlns:cx2="http://schemas.microsoft.com/office/drawing/2015/10/21/chartex" xmlns:cx3="http://schemas.microsoft.com/office/drawing/2016/5/9/chartex" xmlns:cx4="http://schemas.microsoft.com/office/drawing/2016/5/10/chartex" xmlns:cx5="http://schemas.microsoft.com/office/drawing/2016/5/11/chartex" xmlns:cx6="http://schemas.microsoft.com/office/drawing/2016/5/12/chartex" xmlns:cx7="http://schemas.microsoft.com/office/drawing/2016/5/13/chartex" xmlns:cx8="http://schemas.microsoft.com/office/drawing/2016/5/14/chartex" xmlns:mc="http://schemas.openxmlformats.org/markup-compatibility/2006" xmlns:aink="http://schemas.microsoft.com/office/drawing/2016/ink" xmlns:am3d="http://schemas.microsoft.com/office/drawing/2017/model3d" xmlns:o="urn:schemas-microsoft-com:office:office" xmlns:oel="http://schemas.microsoft.com/office/2019/extlst" xmlns:r="http://schemas.openxmlformats.org/officeDocument/2006/relationships" xmlns:m="http://schemas.openxmlformats.org/officeDocument/2006/math" xmlns:v="urn:schemas-microsoft-com:vml" xmlns:wp14="http://schemas.microsoft.com/office/word/2010/wordprocessingDrawing" xmlns:wp="http://schemas.openxmlformats.org/drawingml/2006/wordprocessingDrawing" xmlns:w10="urn:schemas-microsoft-com:office:word" xmlns:w="http://schemas.openxmlformats.org/wordprocessingml/2006/main" xmlns:w14="http://schemas.microsoft.com/office/word/2010/wordml" xmlns:w15="http://schemas.microsoft.com/office/word/2012/wordml" xmlns:w16cex="http://schemas.microsoft.com/office/word/2018/wordml/cex" xmlns:w16cid="http://schemas.microsoft.com/office/word/2016/wordml/cid" xmlns:w16="http://schemas.microsoft.com/office/word/2018/wordml" xmlns:w16du="http://schemas.microsoft.com/office/word/2023/wordml/word16du" xmlns:w16sdtdh="http://schemas.microsoft.com/office/word/2020/wordml/sdtdatahash" xmlns:w16sdtfl="http://schemas.microsoft.com/office/word/2024/wordml/sdtformatlock" xmlns:w16se="http://schemas.microsoft.com/office/word/2015/wordml/symex" xmlns:wpg="http://schemas.microsoft.com/office/word/2010/wordprocessingGroup" xmlns:wpi="http://schemas.microsoft.com/office/word/2010/wordprocessingInk" xmlns:wne="http://schemas.microsoft.com/office/word/2006/wordml" xmlns:wps="http://schemas.microsoft.com/office/word/2010/wordprocessingShape" mc:Ignorable="w14 w15 w16se w16cid w16 w16cex w16sdtdh w16sdtfl w16du wp14">
   <w:abstractNum w:abstractNumId="0" w15:restartNumberingAfterBreak="0">
-    <w:nsid w:val="00CB2354"/>
+    <w:nsid w:val="03A46AEA"/>
     <w:multiLevelType w:val="multilevel"/>
-    <w:tmpl w:val="E8F6EDC2"/>
+    <w:tmpl w:val="D88C20E6"/>
     <w:lvl w:ilvl="0">
       <w:start w:val="1"/>
       <w:numFmt w:val="decimal"/>
@@ -10452,9 +10452,9 @@
     </w:lvl>
   </w:abstractNum>
   <w:abstractNum w:abstractNumId="1" w15:restartNumberingAfterBreak="0">
-    <w:nsid w:val="05CB59C7"/>
+    <w:nsid w:val="04322F20"/>
     <w:multiLevelType w:val="multilevel"/>
-    <w:tmpl w:val="CAFA57F4"/>
+    <w:tmpl w:val="11EA8BE2"/>
     <w:lvl w:ilvl="0">
       <w:start w:val="1"/>
       <w:numFmt w:val="decimal"/>
@@ -10565,9 +10565,9 @@
     </w:lvl>
   </w:abstractNum>
   <w:abstractNum w:abstractNumId="2" w15:restartNumberingAfterBreak="0">
-    <w:nsid w:val="0A3134AC"/>
+    <w:nsid w:val="0B154960"/>
     <w:multiLevelType w:val="multilevel"/>
-    <w:tmpl w:val="F1E684D2"/>
+    <w:tmpl w:val="340E5BB2"/>
     <w:lvl w:ilvl="0">
       <w:start w:val="1"/>
       <w:numFmt w:val="bullet"/>
@@ -10714,122 +10714,9 @@
     </w:lvl>
   </w:abstractNum>
   <w:abstractNum w:abstractNumId="3" w15:restartNumberingAfterBreak="0">
-    <w:nsid w:val="0B80650D"/>
+    <w:nsid w:val="0DC91A01"/>
     <w:multiLevelType w:val="multilevel"/>
-    <w:tmpl w:val="BFBAF644"/>
-    <w:lvl w:ilvl="0">
-      <w:start w:val="1"/>
-      <w:numFmt w:val="decimal"/>
-      <w:lvlText w:val="%1."/>
-      <w:lvlJc w:val="left"/>
-      <w:pPr>
-        <w:tabs>
-          <w:tab w:val="num" w:pos="720"/>
-        </w:tabs>
-        <w:ind w:left="720" w:hanging="360"/>
-      </w:pPr>
-    </w:lvl>
-    <w:lvl w:ilvl="1" w:tentative="1">
-      <w:start w:val="1"/>
-      <w:numFmt w:val="decimal"/>
-      <w:lvlText w:val="%2."/>
-      <w:lvlJc w:val="left"/>
-      <w:pPr>
-        <w:tabs>
-          <w:tab w:val="num" w:pos="1440"/>
-        </w:tabs>
-        <w:ind w:left="1440" w:hanging="360"/>
-      </w:pPr>
-    </w:lvl>
-    <w:lvl w:ilvl="2" w:tentative="1">
-      <w:start w:val="1"/>
-      <w:numFmt w:val="decimal"/>
-      <w:lvlText w:val="%3."/>
-      <w:lvlJc w:val="left"/>
-      <w:pPr>
-        <w:tabs>
-          <w:tab w:val="num" w:pos="2160"/>
-        </w:tabs>
-        <w:ind w:left="2160" w:hanging="360"/>
-      </w:pPr>
-    </w:lvl>
-    <w:lvl w:ilvl="3" w:tentative="1">
-      <w:start w:val="1"/>
-      <w:numFmt w:val="decimal"/>
-      <w:lvlText w:val="%4."/>
-      <w:lvlJc w:val="left"/>
-      <w:pPr>
-        <w:tabs>
-          <w:tab w:val="num" w:pos="2880"/>
-        </w:tabs>
-        <w:ind w:left="2880" w:hanging="360"/>
-      </w:pPr>
-    </w:lvl>
-    <w:lvl w:ilvl="4" w:tentative="1">
-      <w:start w:val="1"/>
-      <w:numFmt w:val="decimal"/>
-      <w:lvlText w:val="%5."/>
-      <w:lvlJc w:val="left"/>
-      <w:pPr>
-        <w:tabs>
-          <w:tab w:val="num" w:pos="3600"/>
-        </w:tabs>
-        <w:ind w:left="3600" w:hanging="360"/>
-      </w:pPr>
-    </w:lvl>
-    <w:lvl w:ilvl="5" w:tentative="1">
-      <w:start w:val="1"/>
-      <w:numFmt w:val="decimal"/>
-      <w:lvlText w:val="%6."/>
-      <w:lvlJc w:val="left"/>
-      <w:pPr>
-        <w:tabs>
-          <w:tab w:val="num" w:pos="4320"/>
-        </w:tabs>
-        <w:ind w:left="4320" w:hanging="360"/>
-      </w:pPr>
-    </w:lvl>
-    <w:lvl w:ilvl="6" w:tentative="1">
-      <w:start w:val="1"/>
-      <w:numFmt w:val="decimal"/>
-      <w:lvlText w:val="%7."/>
-      <w:lvlJc w:val="left"/>
-      <w:pPr>
-        <w:tabs>
-          <w:tab w:val="num" w:pos="5040"/>
-        </w:tabs>
-        <w:ind w:left="5040" w:hanging="360"/>
-      </w:pPr>
-    </w:lvl>
-    <w:lvl w:ilvl="7" w:tentative="1">
-      <w:start w:val="1"/>
-      <w:numFmt w:val="decimal"/>
-      <w:lvlText w:val="%8."/>
-      <w:lvlJc w:val="left"/>
-      <w:pPr>
-        <w:tabs>
-          <w:tab w:val="num" w:pos="5760"/>
-        </w:tabs>
-        <w:ind w:left="5760" w:hanging="360"/>
-      </w:pPr>
-    </w:lvl>
-    <w:lvl w:ilvl="8" w:tentative="1">
-      <w:start w:val="1"/>
-      <w:numFmt w:val="decimal"/>
-      <w:lvlText w:val="%9."/>
-      <w:lvlJc w:val="left"/>
-      <w:pPr>
-        <w:tabs>
-          <w:tab w:val="num" w:pos="6480"/>
-        </w:tabs>
-        <w:ind w:left="6480" w:hanging="360"/>
-      </w:pPr>
-    </w:lvl>
-  </w:abstractNum>
-  <w:abstractNum w:abstractNumId="4" w15:restartNumberingAfterBreak="0">
-    <w:nsid w:val="119958C2"/>
-    <w:multiLevelType w:val="multilevel"/>
-    <w:tmpl w:val="C7520802"/>
+    <w:tmpl w:val="BA224970"/>
     <w:lvl w:ilvl="0">
       <w:start w:val="1"/>
       <w:numFmt w:val="bullet"/>
@@ -10975,462 +10862,10 @@
       </w:rPr>
     </w:lvl>
   </w:abstractNum>
-  <w:abstractNum w:abstractNumId="5" w15:restartNumberingAfterBreak="0">
-    <w:nsid w:val="12F15C42"/>
+  <w:abstractNum w:abstractNumId="4" w15:restartNumberingAfterBreak="0">
+    <w:nsid w:val="10EB44E1"/>
     <w:multiLevelType w:val="multilevel"/>
-    <w:tmpl w:val="3730A304"/>
-    <w:lvl w:ilvl="0">
-      <w:start w:val="1"/>
-      <w:numFmt w:val="decimal"/>
-      <w:lvlText w:val="%1."/>
-      <w:lvlJc w:val="left"/>
-      <w:pPr>
-        <w:tabs>
-          <w:tab w:val="num" w:pos="720"/>
-        </w:tabs>
-        <w:ind w:left="720" w:hanging="360"/>
-      </w:pPr>
-    </w:lvl>
-    <w:lvl w:ilvl="1" w:tentative="1">
-      <w:start w:val="1"/>
-      <w:numFmt w:val="decimal"/>
-      <w:lvlText w:val="%2."/>
-      <w:lvlJc w:val="left"/>
-      <w:pPr>
-        <w:tabs>
-          <w:tab w:val="num" w:pos="1440"/>
-        </w:tabs>
-        <w:ind w:left="1440" w:hanging="360"/>
-      </w:pPr>
-    </w:lvl>
-    <w:lvl w:ilvl="2" w:tentative="1">
-      <w:start w:val="1"/>
-      <w:numFmt w:val="decimal"/>
-      <w:lvlText w:val="%3."/>
-      <w:lvlJc w:val="left"/>
-      <w:pPr>
-        <w:tabs>
-          <w:tab w:val="num" w:pos="2160"/>
-        </w:tabs>
-        <w:ind w:left="2160" w:hanging="360"/>
-      </w:pPr>
-    </w:lvl>
-    <w:lvl w:ilvl="3" w:tentative="1">
-      <w:start w:val="1"/>
-      <w:numFmt w:val="decimal"/>
-      <w:lvlText w:val="%4."/>
-      <w:lvlJc w:val="left"/>
-      <w:pPr>
-        <w:tabs>
-          <w:tab w:val="num" w:pos="2880"/>
-        </w:tabs>
-        <w:ind w:left="2880" w:hanging="360"/>
-      </w:pPr>
-    </w:lvl>
-    <w:lvl w:ilvl="4" w:tentative="1">
-      <w:start w:val="1"/>
-      <w:numFmt w:val="decimal"/>
-      <w:lvlText w:val="%5."/>
-      <w:lvlJc w:val="left"/>
-      <w:pPr>
-        <w:tabs>
-          <w:tab w:val="num" w:pos="3600"/>
-        </w:tabs>
-        <w:ind w:left="3600" w:hanging="360"/>
-      </w:pPr>
-    </w:lvl>
-    <w:lvl w:ilvl="5" w:tentative="1">
-      <w:start w:val="1"/>
-      <w:numFmt w:val="decimal"/>
-      <w:lvlText w:val="%6."/>
-      <w:lvlJc w:val="left"/>
-      <w:pPr>
-        <w:tabs>
-          <w:tab w:val="num" w:pos="4320"/>
-        </w:tabs>
-        <w:ind w:left="4320" w:hanging="360"/>
-      </w:pPr>
-    </w:lvl>
-    <w:lvl w:ilvl="6" w:tentative="1">
-      <w:start w:val="1"/>
-      <w:numFmt w:val="decimal"/>
-      <w:lvlText w:val="%7."/>
-      <w:lvlJc w:val="left"/>
-      <w:pPr>
-        <w:tabs>
-          <w:tab w:val="num" w:pos="5040"/>
-        </w:tabs>
-        <w:ind w:left="5040" w:hanging="360"/>
-      </w:pPr>
-    </w:lvl>
-    <w:lvl w:ilvl="7" w:tentative="1">
-      <w:start w:val="1"/>
-      <w:numFmt w:val="decimal"/>
-      <w:lvlText w:val="%8."/>
-      <w:lvlJc w:val="left"/>
-      <w:pPr>
-        <w:tabs>
-          <w:tab w:val="num" w:pos="5760"/>
-        </w:tabs>
-        <w:ind w:left="5760" w:hanging="360"/>
-      </w:pPr>
-    </w:lvl>
-    <w:lvl w:ilvl="8" w:tentative="1">
-      <w:start w:val="1"/>
-      <w:numFmt w:val="decimal"/>
-      <w:lvlText w:val="%9."/>
-      <w:lvlJc w:val="left"/>
-      <w:pPr>
-        <w:tabs>
-          <w:tab w:val="num" w:pos="6480"/>
-        </w:tabs>
-        <w:ind w:left="6480" w:hanging="360"/>
-      </w:pPr>
-    </w:lvl>
-  </w:abstractNum>
-  <w:abstractNum w:abstractNumId="6" w15:restartNumberingAfterBreak="0">
-    <w:nsid w:val="13683945"/>
-    <w:multiLevelType w:val="multilevel"/>
-    <w:tmpl w:val="78D8706A"/>
-    <w:lvl w:ilvl="0">
-      <w:start w:val="1"/>
-      <w:numFmt w:val="decimal"/>
-      <w:lvlText w:val="%1."/>
-      <w:lvlJc w:val="left"/>
-      <w:pPr>
-        <w:tabs>
-          <w:tab w:val="num" w:pos="720"/>
-        </w:tabs>
-        <w:ind w:left="720" w:hanging="360"/>
-      </w:pPr>
-    </w:lvl>
-    <w:lvl w:ilvl="1" w:tentative="1">
-      <w:start w:val="1"/>
-      <w:numFmt w:val="decimal"/>
-      <w:lvlText w:val="%2."/>
-      <w:lvlJc w:val="left"/>
-      <w:pPr>
-        <w:tabs>
-          <w:tab w:val="num" w:pos="1440"/>
-        </w:tabs>
-        <w:ind w:left="1440" w:hanging="360"/>
-      </w:pPr>
-    </w:lvl>
-    <w:lvl w:ilvl="2" w:tentative="1">
-      <w:start w:val="1"/>
-      <w:numFmt w:val="decimal"/>
-      <w:lvlText w:val="%3."/>
-      <w:lvlJc w:val="left"/>
-      <w:pPr>
-        <w:tabs>
-          <w:tab w:val="num" w:pos="2160"/>
-        </w:tabs>
-        <w:ind w:left="2160" w:hanging="360"/>
-      </w:pPr>
-    </w:lvl>
-    <w:lvl w:ilvl="3" w:tentative="1">
-      <w:start w:val="1"/>
-      <w:numFmt w:val="decimal"/>
-      <w:lvlText w:val="%4."/>
-      <w:lvlJc w:val="left"/>
-      <w:pPr>
-        <w:tabs>
-          <w:tab w:val="num" w:pos="2880"/>
-        </w:tabs>
-        <w:ind w:left="2880" w:hanging="360"/>
-      </w:pPr>
-    </w:lvl>
-    <w:lvl w:ilvl="4" w:tentative="1">
-      <w:start w:val="1"/>
-      <w:numFmt w:val="decimal"/>
-      <w:lvlText w:val="%5."/>
-      <w:lvlJc w:val="left"/>
-      <w:pPr>
-        <w:tabs>
-          <w:tab w:val="num" w:pos="3600"/>
-        </w:tabs>
-        <w:ind w:left="3600" w:hanging="360"/>
-      </w:pPr>
-    </w:lvl>
-    <w:lvl w:ilvl="5" w:tentative="1">
-      <w:start w:val="1"/>
-      <w:numFmt w:val="decimal"/>
-      <w:lvlText w:val="%6."/>
-      <w:lvlJc w:val="left"/>
-      <w:pPr>
-        <w:tabs>
-          <w:tab w:val="num" w:pos="4320"/>
-        </w:tabs>
-        <w:ind w:left="4320" w:hanging="360"/>
-      </w:pPr>
-    </w:lvl>
-    <w:lvl w:ilvl="6" w:tentative="1">
-      <w:start w:val="1"/>
-      <w:numFmt w:val="decimal"/>
-      <w:lvlText w:val="%7."/>
-      <w:lvlJc w:val="left"/>
-      <w:pPr>
-        <w:tabs>
-          <w:tab w:val="num" w:pos="5040"/>
-        </w:tabs>
-        <w:ind w:left="5040" w:hanging="360"/>
-      </w:pPr>
-    </w:lvl>
-    <w:lvl w:ilvl="7" w:tentative="1">
-      <w:start w:val="1"/>
-      <w:numFmt w:val="decimal"/>
-      <w:lvlText w:val="%8."/>
-      <w:lvlJc w:val="left"/>
-      <w:pPr>
-        <w:tabs>
-          <w:tab w:val="num" w:pos="5760"/>
-        </w:tabs>
-        <w:ind w:left="5760" w:hanging="360"/>
-      </w:pPr>
-    </w:lvl>
-    <w:lvl w:ilvl="8" w:tentative="1">
-      <w:start w:val="1"/>
-      <w:numFmt w:val="decimal"/>
-      <w:lvlText w:val="%9."/>
-      <w:lvlJc w:val="left"/>
-      <w:pPr>
-        <w:tabs>
-          <w:tab w:val="num" w:pos="6480"/>
-        </w:tabs>
-        <w:ind w:left="6480" w:hanging="360"/>
-      </w:pPr>
-    </w:lvl>
-  </w:abstractNum>
-  <w:abstractNum w:abstractNumId="7" w15:restartNumberingAfterBreak="0">
-    <w:nsid w:val="197F603A"/>
-    <w:multiLevelType w:val="multilevel"/>
-    <w:tmpl w:val="DD6E413C"/>
-    <w:lvl w:ilvl="0">
-      <w:start w:val="1"/>
-      <w:numFmt w:val="decimal"/>
-      <w:lvlText w:val="%1."/>
-      <w:lvlJc w:val="left"/>
-      <w:pPr>
-        <w:tabs>
-          <w:tab w:val="num" w:pos="720"/>
-        </w:tabs>
-        <w:ind w:left="720" w:hanging="360"/>
-      </w:pPr>
-    </w:lvl>
-    <w:lvl w:ilvl="1" w:tentative="1">
-      <w:start w:val="1"/>
-      <w:numFmt w:val="decimal"/>
-      <w:lvlText w:val="%2."/>
-      <w:lvlJc w:val="left"/>
-      <w:pPr>
-        <w:tabs>
-          <w:tab w:val="num" w:pos="1440"/>
-        </w:tabs>
-        <w:ind w:left="1440" w:hanging="360"/>
-      </w:pPr>
-    </w:lvl>
-    <w:lvl w:ilvl="2" w:tentative="1">
-      <w:start w:val="1"/>
-      <w:numFmt w:val="decimal"/>
-      <w:lvlText w:val="%3."/>
-      <w:lvlJc w:val="left"/>
-      <w:pPr>
-        <w:tabs>
-          <w:tab w:val="num" w:pos="2160"/>
-        </w:tabs>
-        <w:ind w:left="2160" w:hanging="360"/>
-      </w:pPr>
-    </w:lvl>
-    <w:lvl w:ilvl="3" w:tentative="1">
-      <w:start w:val="1"/>
-      <w:numFmt w:val="decimal"/>
-      <w:lvlText w:val="%4."/>
-      <w:lvlJc w:val="left"/>
-      <w:pPr>
-        <w:tabs>
-          <w:tab w:val="num" w:pos="2880"/>
-        </w:tabs>
-        <w:ind w:left="2880" w:hanging="360"/>
-      </w:pPr>
-    </w:lvl>
-    <w:lvl w:ilvl="4" w:tentative="1">
-      <w:start w:val="1"/>
-      <w:numFmt w:val="decimal"/>
-      <w:lvlText w:val="%5."/>
-      <w:lvlJc w:val="left"/>
-      <w:pPr>
-        <w:tabs>
-          <w:tab w:val="num" w:pos="3600"/>
-        </w:tabs>
-        <w:ind w:left="3600" w:hanging="360"/>
-      </w:pPr>
-    </w:lvl>
-    <w:lvl w:ilvl="5" w:tentative="1">
-      <w:start w:val="1"/>
-      <w:numFmt w:val="decimal"/>
-      <w:lvlText w:val="%6."/>
-      <w:lvlJc w:val="left"/>
-      <w:pPr>
-        <w:tabs>
-          <w:tab w:val="num" w:pos="4320"/>
-        </w:tabs>
-        <w:ind w:left="4320" w:hanging="360"/>
-      </w:pPr>
-    </w:lvl>
-    <w:lvl w:ilvl="6" w:tentative="1">
-      <w:start w:val="1"/>
-      <w:numFmt w:val="decimal"/>
-      <w:lvlText w:val="%7."/>
-      <w:lvlJc w:val="left"/>
-      <w:pPr>
-        <w:tabs>
-          <w:tab w:val="num" w:pos="5040"/>
-        </w:tabs>
-        <w:ind w:left="5040" w:hanging="360"/>
-      </w:pPr>
-    </w:lvl>
-    <w:lvl w:ilvl="7" w:tentative="1">
-      <w:start w:val="1"/>
-      <w:numFmt w:val="decimal"/>
-      <w:lvlText w:val="%8."/>
-      <w:lvlJc w:val="left"/>
-      <w:pPr>
-        <w:tabs>
-          <w:tab w:val="num" w:pos="5760"/>
-        </w:tabs>
-        <w:ind w:left="5760" w:hanging="360"/>
-      </w:pPr>
-    </w:lvl>
-    <w:lvl w:ilvl="8" w:tentative="1">
-      <w:start w:val="1"/>
-      <w:numFmt w:val="decimal"/>
-      <w:lvlText w:val="%9."/>
-      <w:lvlJc w:val="left"/>
-      <w:pPr>
-        <w:tabs>
-          <w:tab w:val="num" w:pos="6480"/>
-        </w:tabs>
-        <w:ind w:left="6480" w:hanging="360"/>
-      </w:pPr>
-    </w:lvl>
-  </w:abstractNum>
-  <w:abstractNum w:abstractNumId="8" w15:restartNumberingAfterBreak="0">
-    <w:nsid w:val="1E6662A2"/>
-    <w:multiLevelType w:val="multilevel"/>
-    <w:tmpl w:val="65641CD0"/>
-    <w:lvl w:ilvl="0">
-      <w:start w:val="1"/>
-      <w:numFmt w:val="decimal"/>
-      <w:lvlText w:val="%1."/>
-      <w:lvlJc w:val="left"/>
-      <w:pPr>
-        <w:tabs>
-          <w:tab w:val="num" w:pos="720"/>
-        </w:tabs>
-        <w:ind w:left="720" w:hanging="360"/>
-      </w:pPr>
-    </w:lvl>
-    <w:lvl w:ilvl="1" w:tentative="1">
-      <w:start w:val="1"/>
-      <w:numFmt w:val="decimal"/>
-      <w:lvlText w:val="%2."/>
-      <w:lvlJc w:val="left"/>
-      <w:pPr>
-        <w:tabs>
-          <w:tab w:val="num" w:pos="1440"/>
-        </w:tabs>
-        <w:ind w:left="1440" w:hanging="360"/>
-      </w:pPr>
-    </w:lvl>
-    <w:lvl w:ilvl="2" w:tentative="1">
-      <w:start w:val="1"/>
-      <w:numFmt w:val="decimal"/>
-      <w:lvlText w:val="%3."/>
-      <w:lvlJc w:val="left"/>
-      <w:pPr>
-        <w:tabs>
-          <w:tab w:val="num" w:pos="2160"/>
-        </w:tabs>
-        <w:ind w:left="2160" w:hanging="360"/>
-      </w:pPr>
-    </w:lvl>
-    <w:lvl w:ilvl="3" w:tentative="1">
-      <w:start w:val="1"/>
-      <w:numFmt w:val="decimal"/>
-      <w:lvlText w:val="%4."/>
-      <w:lvlJc w:val="left"/>
-      <w:pPr>
-        <w:tabs>
-          <w:tab w:val="num" w:pos="2880"/>
-        </w:tabs>
-        <w:ind w:left="2880" w:hanging="360"/>
-      </w:pPr>
-    </w:lvl>
-    <w:lvl w:ilvl="4" w:tentative="1">
-      <w:start w:val="1"/>
-      <w:numFmt w:val="decimal"/>
-      <w:lvlText w:val="%5."/>
-      <w:lvlJc w:val="left"/>
-      <w:pPr>
-        <w:tabs>
-          <w:tab w:val="num" w:pos="3600"/>
-        </w:tabs>
-        <w:ind w:left="3600" w:hanging="360"/>
-      </w:pPr>
-    </w:lvl>
-    <w:lvl w:ilvl="5" w:tentative="1">
-      <w:start w:val="1"/>
-      <w:numFmt w:val="decimal"/>
-      <w:lvlText w:val="%6."/>
-      <w:lvlJc w:val="left"/>
-      <w:pPr>
-        <w:tabs>
-          <w:tab w:val="num" w:pos="4320"/>
-        </w:tabs>
-        <w:ind w:left="4320" w:hanging="360"/>
-      </w:pPr>
-    </w:lvl>
-    <w:lvl w:ilvl="6" w:tentative="1">
-      <w:start w:val="1"/>
-      <w:numFmt w:val="decimal"/>
-      <w:lvlText w:val="%7."/>
-      <w:lvlJc w:val="left"/>
-      <w:pPr>
-        <w:tabs>
-          <w:tab w:val="num" w:pos="5040"/>
-        </w:tabs>
-        <w:ind w:left="5040" w:hanging="360"/>
-      </w:pPr>
-    </w:lvl>
-    <w:lvl w:ilvl="7" w:tentative="1">
-      <w:start w:val="1"/>
-      <w:numFmt w:val="decimal"/>
-      <w:lvlText w:val="%8."/>
-      <w:lvlJc w:val="left"/>
-      <w:pPr>
-        <w:tabs>
-          <w:tab w:val="num" w:pos="5760"/>
-        </w:tabs>
-        <w:ind w:left="5760" w:hanging="360"/>
-      </w:pPr>
-    </w:lvl>
-    <w:lvl w:ilvl="8" w:tentative="1">
-      <w:start w:val="1"/>
-      <w:numFmt w:val="decimal"/>
-      <w:lvlText w:val="%9."/>
-      <w:lvlJc w:val="left"/>
-      <w:pPr>
-        <w:tabs>
-          <w:tab w:val="num" w:pos="6480"/>
-        </w:tabs>
-        <w:ind w:left="6480" w:hanging="360"/>
-      </w:pPr>
-    </w:lvl>
-  </w:abstractNum>
-  <w:abstractNum w:abstractNumId="9" w15:restartNumberingAfterBreak="0">
-    <w:nsid w:val="1EAF4F6D"/>
-    <w:multiLevelType w:val="multilevel"/>
-    <w:tmpl w:val="B49A1F80"/>
+    <w:tmpl w:val="5EE4AF82"/>
     <w:lvl w:ilvl="0">
       <w:start w:val="1"/>
       <w:numFmt w:val="bullet"/>
@@ -11576,10 +11011,575 @@
       </w:rPr>
     </w:lvl>
   </w:abstractNum>
+  <w:abstractNum w:abstractNumId="5" w15:restartNumberingAfterBreak="0">
+    <w:nsid w:val="22BD6C92"/>
+    <w:multiLevelType w:val="multilevel"/>
+    <w:tmpl w:val="FC5C18E0"/>
+    <w:lvl w:ilvl="0">
+      <w:start w:val="1"/>
+      <w:numFmt w:val="decimal"/>
+      <w:lvlText w:val="%1."/>
+      <w:lvlJc w:val="left"/>
+      <w:pPr>
+        <w:tabs>
+          <w:tab w:val="num" w:pos="720"/>
+        </w:tabs>
+        <w:ind w:left="720" w:hanging="360"/>
+      </w:pPr>
+    </w:lvl>
+    <w:lvl w:ilvl="1" w:tentative="1">
+      <w:start w:val="1"/>
+      <w:numFmt w:val="decimal"/>
+      <w:lvlText w:val="%2."/>
+      <w:lvlJc w:val="left"/>
+      <w:pPr>
+        <w:tabs>
+          <w:tab w:val="num" w:pos="1440"/>
+        </w:tabs>
+        <w:ind w:left="1440" w:hanging="360"/>
+      </w:pPr>
+    </w:lvl>
+    <w:lvl w:ilvl="2" w:tentative="1">
+      <w:start w:val="1"/>
+      <w:numFmt w:val="decimal"/>
+      <w:lvlText w:val="%3."/>
+      <w:lvlJc w:val="left"/>
+      <w:pPr>
+        <w:tabs>
+          <w:tab w:val="num" w:pos="2160"/>
+        </w:tabs>
+        <w:ind w:left="2160" w:hanging="360"/>
+      </w:pPr>
+    </w:lvl>
+    <w:lvl w:ilvl="3" w:tentative="1">
+      <w:start w:val="1"/>
+      <w:numFmt w:val="decimal"/>
+      <w:lvlText w:val="%4."/>
+      <w:lvlJc w:val="left"/>
+      <w:pPr>
+        <w:tabs>
+          <w:tab w:val="num" w:pos="2880"/>
+        </w:tabs>
+        <w:ind w:left="2880" w:hanging="360"/>
+      </w:pPr>
+    </w:lvl>
+    <w:lvl w:ilvl="4" w:tentative="1">
+      <w:start w:val="1"/>
+      <w:numFmt w:val="decimal"/>
+      <w:lvlText w:val="%5."/>
+      <w:lvlJc w:val="left"/>
+      <w:pPr>
+        <w:tabs>
+          <w:tab w:val="num" w:pos="3600"/>
+        </w:tabs>
+        <w:ind w:left="3600" w:hanging="360"/>
+      </w:pPr>
+    </w:lvl>
+    <w:lvl w:ilvl="5" w:tentative="1">
+      <w:start w:val="1"/>
+      <w:numFmt w:val="decimal"/>
+      <w:lvlText w:val="%6."/>
+      <w:lvlJc w:val="left"/>
+      <w:pPr>
+        <w:tabs>
+          <w:tab w:val="num" w:pos="4320"/>
+        </w:tabs>
+        <w:ind w:left="4320" w:hanging="360"/>
+      </w:pPr>
+    </w:lvl>
+    <w:lvl w:ilvl="6" w:tentative="1">
+      <w:start w:val="1"/>
+      <w:numFmt w:val="decimal"/>
+      <w:lvlText w:val="%7."/>
+      <w:lvlJc w:val="left"/>
+      <w:pPr>
+        <w:tabs>
+          <w:tab w:val="num" w:pos="5040"/>
+        </w:tabs>
+        <w:ind w:left="5040" w:hanging="360"/>
+      </w:pPr>
+    </w:lvl>
+    <w:lvl w:ilvl="7" w:tentative="1">
+      <w:start w:val="1"/>
+      <w:numFmt w:val="decimal"/>
+      <w:lvlText w:val="%8."/>
+      <w:lvlJc w:val="left"/>
+      <w:pPr>
+        <w:tabs>
+          <w:tab w:val="num" w:pos="5760"/>
+        </w:tabs>
+        <w:ind w:left="5760" w:hanging="360"/>
+      </w:pPr>
+    </w:lvl>
+    <w:lvl w:ilvl="8" w:tentative="1">
+      <w:start w:val="1"/>
+      <w:numFmt w:val="decimal"/>
+      <w:lvlText w:val="%9."/>
+      <w:lvlJc w:val="left"/>
+      <w:pPr>
+        <w:tabs>
+          <w:tab w:val="num" w:pos="6480"/>
+        </w:tabs>
+        <w:ind w:left="6480" w:hanging="360"/>
+      </w:pPr>
+    </w:lvl>
+  </w:abstractNum>
+  <w:abstractNum w:abstractNumId="6" w15:restartNumberingAfterBreak="0">
+    <w:nsid w:val="255F77E8"/>
+    <w:multiLevelType w:val="multilevel"/>
+    <w:tmpl w:val="90D241D0"/>
+    <w:lvl w:ilvl="0">
+      <w:start w:val="1"/>
+      <w:numFmt w:val="decimal"/>
+      <w:lvlText w:val="%1."/>
+      <w:lvlJc w:val="left"/>
+      <w:pPr>
+        <w:tabs>
+          <w:tab w:val="num" w:pos="720"/>
+        </w:tabs>
+        <w:ind w:left="720" w:hanging="360"/>
+      </w:pPr>
+    </w:lvl>
+    <w:lvl w:ilvl="1" w:tentative="1">
+      <w:start w:val="1"/>
+      <w:numFmt w:val="decimal"/>
+      <w:lvlText w:val="%2."/>
+      <w:lvlJc w:val="left"/>
+      <w:pPr>
+        <w:tabs>
+          <w:tab w:val="num" w:pos="1440"/>
+        </w:tabs>
+        <w:ind w:left="1440" w:hanging="360"/>
+      </w:pPr>
+    </w:lvl>
+    <w:lvl w:ilvl="2" w:tentative="1">
+      <w:start w:val="1"/>
+      <w:numFmt w:val="decimal"/>
+      <w:lvlText w:val="%3."/>
+      <w:lvlJc w:val="left"/>
+      <w:pPr>
+        <w:tabs>
+          <w:tab w:val="num" w:pos="2160"/>
+        </w:tabs>
+        <w:ind w:left="2160" w:hanging="360"/>
+      </w:pPr>
+    </w:lvl>
+    <w:lvl w:ilvl="3" w:tentative="1">
+      <w:start w:val="1"/>
+      <w:numFmt w:val="decimal"/>
+      <w:lvlText w:val="%4."/>
+      <w:lvlJc w:val="left"/>
+      <w:pPr>
+        <w:tabs>
+          <w:tab w:val="num" w:pos="2880"/>
+        </w:tabs>
+        <w:ind w:left="2880" w:hanging="360"/>
+      </w:pPr>
+    </w:lvl>
+    <w:lvl w:ilvl="4" w:tentative="1">
+      <w:start w:val="1"/>
+      <w:numFmt w:val="decimal"/>
+      <w:lvlText w:val="%5."/>
+      <w:lvlJc w:val="left"/>
+      <w:pPr>
+        <w:tabs>
+          <w:tab w:val="num" w:pos="3600"/>
+        </w:tabs>
+        <w:ind w:left="3600" w:hanging="360"/>
+      </w:pPr>
+    </w:lvl>
+    <w:lvl w:ilvl="5" w:tentative="1">
+      <w:start w:val="1"/>
+      <w:numFmt w:val="decimal"/>
+      <w:lvlText w:val="%6."/>
+      <w:lvlJc w:val="left"/>
+      <w:pPr>
+        <w:tabs>
+          <w:tab w:val="num" w:pos="4320"/>
+        </w:tabs>
+        <w:ind w:left="4320" w:hanging="360"/>
+      </w:pPr>
+    </w:lvl>
+    <w:lvl w:ilvl="6" w:tentative="1">
+      <w:start w:val="1"/>
+      <w:numFmt w:val="decimal"/>
+      <w:lvlText w:val="%7."/>
+      <w:lvlJc w:val="left"/>
+      <w:pPr>
+        <w:tabs>
+          <w:tab w:val="num" w:pos="5040"/>
+        </w:tabs>
+        <w:ind w:left="5040" w:hanging="360"/>
+      </w:pPr>
+    </w:lvl>
+    <w:lvl w:ilvl="7" w:tentative="1">
+      <w:start w:val="1"/>
+      <w:numFmt w:val="decimal"/>
+      <w:lvlText w:val="%8."/>
+      <w:lvlJc w:val="left"/>
+      <w:pPr>
+        <w:tabs>
+          <w:tab w:val="num" w:pos="5760"/>
+        </w:tabs>
+        <w:ind w:left="5760" w:hanging="360"/>
+      </w:pPr>
+    </w:lvl>
+    <w:lvl w:ilvl="8" w:tentative="1">
+      <w:start w:val="1"/>
+      <w:numFmt w:val="decimal"/>
+      <w:lvlText w:val="%9."/>
+      <w:lvlJc w:val="left"/>
+      <w:pPr>
+        <w:tabs>
+          <w:tab w:val="num" w:pos="6480"/>
+        </w:tabs>
+        <w:ind w:left="6480" w:hanging="360"/>
+      </w:pPr>
+    </w:lvl>
+  </w:abstractNum>
+  <w:abstractNum w:abstractNumId="7" w15:restartNumberingAfterBreak="0">
+    <w:nsid w:val="26345BBE"/>
+    <w:multiLevelType w:val="multilevel"/>
+    <w:tmpl w:val="B9C414C6"/>
+    <w:lvl w:ilvl="0">
+      <w:start w:val="1"/>
+      <w:numFmt w:val="decimal"/>
+      <w:lvlText w:val="%1."/>
+      <w:lvlJc w:val="left"/>
+      <w:pPr>
+        <w:tabs>
+          <w:tab w:val="num" w:pos="720"/>
+        </w:tabs>
+        <w:ind w:left="720" w:hanging="360"/>
+      </w:pPr>
+    </w:lvl>
+    <w:lvl w:ilvl="1" w:tentative="1">
+      <w:start w:val="1"/>
+      <w:numFmt w:val="decimal"/>
+      <w:lvlText w:val="%2."/>
+      <w:lvlJc w:val="left"/>
+      <w:pPr>
+        <w:tabs>
+          <w:tab w:val="num" w:pos="1440"/>
+        </w:tabs>
+        <w:ind w:left="1440" w:hanging="360"/>
+      </w:pPr>
+    </w:lvl>
+    <w:lvl w:ilvl="2" w:tentative="1">
+      <w:start w:val="1"/>
+      <w:numFmt w:val="decimal"/>
+      <w:lvlText w:val="%3."/>
+      <w:lvlJc w:val="left"/>
+      <w:pPr>
+        <w:tabs>
+          <w:tab w:val="num" w:pos="2160"/>
+        </w:tabs>
+        <w:ind w:left="2160" w:hanging="360"/>
+      </w:pPr>
+    </w:lvl>
+    <w:lvl w:ilvl="3" w:tentative="1">
+      <w:start w:val="1"/>
+      <w:numFmt w:val="decimal"/>
+      <w:lvlText w:val="%4."/>
+      <w:lvlJc w:val="left"/>
+      <w:pPr>
+        <w:tabs>
+          <w:tab w:val="num" w:pos="2880"/>
+        </w:tabs>
+        <w:ind w:left="2880" w:hanging="360"/>
+      </w:pPr>
+    </w:lvl>
+    <w:lvl w:ilvl="4" w:tentative="1">
+      <w:start w:val="1"/>
+      <w:numFmt w:val="decimal"/>
+      <w:lvlText w:val="%5."/>
+      <w:lvlJc w:val="left"/>
+      <w:pPr>
+        <w:tabs>
+          <w:tab w:val="num" w:pos="3600"/>
+        </w:tabs>
+        <w:ind w:left="3600" w:hanging="360"/>
+      </w:pPr>
+    </w:lvl>
+    <w:lvl w:ilvl="5" w:tentative="1">
+      <w:start w:val="1"/>
+      <w:numFmt w:val="decimal"/>
+      <w:lvlText w:val="%6."/>
+      <w:lvlJc w:val="left"/>
+      <w:pPr>
+        <w:tabs>
+          <w:tab w:val="num" w:pos="4320"/>
+        </w:tabs>
+        <w:ind w:left="4320" w:hanging="360"/>
+      </w:pPr>
+    </w:lvl>
+    <w:lvl w:ilvl="6" w:tentative="1">
+      <w:start w:val="1"/>
+      <w:numFmt w:val="decimal"/>
+      <w:lvlText w:val="%7."/>
+      <w:lvlJc w:val="left"/>
+      <w:pPr>
+        <w:tabs>
+          <w:tab w:val="num" w:pos="5040"/>
+        </w:tabs>
+        <w:ind w:left="5040" w:hanging="360"/>
+      </w:pPr>
+    </w:lvl>
+    <w:lvl w:ilvl="7" w:tentative="1">
+      <w:start w:val="1"/>
+      <w:numFmt w:val="decimal"/>
+      <w:lvlText w:val="%8."/>
+      <w:lvlJc w:val="left"/>
+      <w:pPr>
+        <w:tabs>
+          <w:tab w:val="num" w:pos="5760"/>
+        </w:tabs>
+        <w:ind w:left="5760" w:hanging="360"/>
+      </w:pPr>
+    </w:lvl>
+    <w:lvl w:ilvl="8" w:tentative="1">
+      <w:start w:val="1"/>
+      <w:numFmt w:val="decimal"/>
+      <w:lvlText w:val="%9."/>
+      <w:lvlJc w:val="left"/>
+      <w:pPr>
+        <w:tabs>
+          <w:tab w:val="num" w:pos="6480"/>
+        </w:tabs>
+        <w:ind w:left="6480" w:hanging="360"/>
+      </w:pPr>
+    </w:lvl>
+  </w:abstractNum>
+  <w:abstractNum w:abstractNumId="8" w15:restartNumberingAfterBreak="0">
+    <w:nsid w:val="29543804"/>
+    <w:multiLevelType w:val="multilevel"/>
+    <w:tmpl w:val="69EE6CB4"/>
+    <w:lvl w:ilvl="0">
+      <w:start w:val="1"/>
+      <w:numFmt w:val="decimal"/>
+      <w:lvlText w:val="%1."/>
+      <w:lvlJc w:val="left"/>
+      <w:pPr>
+        <w:tabs>
+          <w:tab w:val="num" w:pos="720"/>
+        </w:tabs>
+        <w:ind w:left="720" w:hanging="360"/>
+      </w:pPr>
+    </w:lvl>
+    <w:lvl w:ilvl="1" w:tentative="1">
+      <w:start w:val="1"/>
+      <w:numFmt w:val="decimal"/>
+      <w:lvlText w:val="%2."/>
+      <w:lvlJc w:val="left"/>
+      <w:pPr>
+        <w:tabs>
+          <w:tab w:val="num" w:pos="1440"/>
+        </w:tabs>
+        <w:ind w:left="1440" w:hanging="360"/>
+      </w:pPr>
+    </w:lvl>
+    <w:lvl w:ilvl="2" w:tentative="1">
+      <w:start w:val="1"/>
+      <w:numFmt w:val="decimal"/>
+      <w:lvlText w:val="%3."/>
+      <w:lvlJc w:val="left"/>
+      <w:pPr>
+        <w:tabs>
+          <w:tab w:val="num" w:pos="2160"/>
+        </w:tabs>
+        <w:ind w:left="2160" w:hanging="360"/>
+      </w:pPr>
+    </w:lvl>
+    <w:lvl w:ilvl="3" w:tentative="1">
+      <w:start w:val="1"/>
+      <w:numFmt w:val="decimal"/>
+      <w:lvlText w:val="%4."/>
+      <w:lvlJc w:val="left"/>
+      <w:pPr>
+        <w:tabs>
+          <w:tab w:val="num" w:pos="2880"/>
+        </w:tabs>
+        <w:ind w:left="2880" w:hanging="360"/>
+      </w:pPr>
+    </w:lvl>
+    <w:lvl w:ilvl="4" w:tentative="1">
+      <w:start w:val="1"/>
+      <w:numFmt w:val="decimal"/>
+      <w:lvlText w:val="%5."/>
+      <w:lvlJc w:val="left"/>
+      <w:pPr>
+        <w:tabs>
+          <w:tab w:val="num" w:pos="3600"/>
+        </w:tabs>
+        <w:ind w:left="3600" w:hanging="360"/>
+      </w:pPr>
+    </w:lvl>
+    <w:lvl w:ilvl="5" w:tentative="1">
+      <w:start w:val="1"/>
+      <w:numFmt w:val="decimal"/>
+      <w:lvlText w:val="%6."/>
+      <w:lvlJc w:val="left"/>
+      <w:pPr>
+        <w:tabs>
+          <w:tab w:val="num" w:pos="4320"/>
+        </w:tabs>
+        <w:ind w:left="4320" w:hanging="360"/>
+      </w:pPr>
+    </w:lvl>
+    <w:lvl w:ilvl="6" w:tentative="1">
+      <w:start w:val="1"/>
+      <w:numFmt w:val="decimal"/>
+      <w:lvlText w:val="%7."/>
+      <w:lvlJc w:val="left"/>
+      <w:pPr>
+        <w:tabs>
+          <w:tab w:val="num" w:pos="5040"/>
+        </w:tabs>
+        <w:ind w:left="5040" w:hanging="360"/>
+      </w:pPr>
+    </w:lvl>
+    <w:lvl w:ilvl="7" w:tentative="1">
+      <w:start w:val="1"/>
+      <w:numFmt w:val="decimal"/>
+      <w:lvlText w:val="%8."/>
+      <w:lvlJc w:val="left"/>
+      <w:pPr>
+        <w:tabs>
+          <w:tab w:val="num" w:pos="5760"/>
+        </w:tabs>
+        <w:ind w:left="5760" w:hanging="360"/>
+      </w:pPr>
+    </w:lvl>
+    <w:lvl w:ilvl="8" w:tentative="1">
+      <w:start w:val="1"/>
+      <w:numFmt w:val="decimal"/>
+      <w:lvlText w:val="%9."/>
+      <w:lvlJc w:val="left"/>
+      <w:pPr>
+        <w:tabs>
+          <w:tab w:val="num" w:pos="6480"/>
+        </w:tabs>
+        <w:ind w:left="6480" w:hanging="360"/>
+      </w:pPr>
+    </w:lvl>
+  </w:abstractNum>
+  <w:abstractNum w:abstractNumId="9" w15:restartNumberingAfterBreak="0">
+    <w:nsid w:val="2B202000"/>
+    <w:multiLevelType w:val="multilevel"/>
+    <w:tmpl w:val="927AE502"/>
+    <w:lvl w:ilvl="0">
+      <w:start w:val="1"/>
+      <w:numFmt w:val="decimal"/>
+      <w:lvlText w:val="%1."/>
+      <w:lvlJc w:val="left"/>
+      <w:pPr>
+        <w:tabs>
+          <w:tab w:val="num" w:pos="720"/>
+        </w:tabs>
+        <w:ind w:left="720" w:hanging="360"/>
+      </w:pPr>
+    </w:lvl>
+    <w:lvl w:ilvl="1" w:tentative="1">
+      <w:start w:val="1"/>
+      <w:numFmt w:val="decimal"/>
+      <w:lvlText w:val="%2."/>
+      <w:lvlJc w:val="left"/>
+      <w:pPr>
+        <w:tabs>
+          <w:tab w:val="num" w:pos="1440"/>
+        </w:tabs>
+        <w:ind w:left="1440" w:hanging="360"/>
+      </w:pPr>
+    </w:lvl>
+    <w:lvl w:ilvl="2" w:tentative="1">
+      <w:start w:val="1"/>
+      <w:numFmt w:val="decimal"/>
+      <w:lvlText w:val="%3."/>
+      <w:lvlJc w:val="left"/>
+      <w:pPr>
+        <w:tabs>
+          <w:tab w:val="num" w:pos="2160"/>
+        </w:tabs>
+        <w:ind w:left="2160" w:hanging="360"/>
+      </w:pPr>
+    </w:lvl>
+    <w:lvl w:ilvl="3" w:tentative="1">
+      <w:start w:val="1"/>
+      <w:numFmt w:val="decimal"/>
+      <w:lvlText w:val="%4."/>
+      <w:lvlJc w:val="left"/>
+      <w:pPr>
+        <w:tabs>
+          <w:tab w:val="num" w:pos="2880"/>
+        </w:tabs>
+        <w:ind w:left="2880" w:hanging="360"/>
+      </w:pPr>
+    </w:lvl>
+    <w:lvl w:ilvl="4" w:tentative="1">
+      <w:start w:val="1"/>
+      <w:numFmt w:val="decimal"/>
+      <w:lvlText w:val="%5."/>
+      <w:lvlJc w:val="left"/>
+      <w:pPr>
+        <w:tabs>
+          <w:tab w:val="num" w:pos="3600"/>
+        </w:tabs>
+        <w:ind w:left="3600" w:hanging="360"/>
+      </w:pPr>
+    </w:lvl>
+    <w:lvl w:ilvl="5" w:tentative="1">
+      <w:start w:val="1"/>
+      <w:numFmt w:val="decimal"/>
+      <w:lvlText w:val="%6."/>
+      <w:lvlJc w:val="left"/>
+      <w:pPr>
+        <w:tabs>
+          <w:tab w:val="num" w:pos="4320"/>
+        </w:tabs>
+        <w:ind w:left="4320" w:hanging="360"/>
+      </w:pPr>
+    </w:lvl>
+    <w:lvl w:ilvl="6" w:tentative="1">
+      <w:start w:val="1"/>
+      <w:numFmt w:val="decimal"/>
+      <w:lvlText w:val="%7."/>
+      <w:lvlJc w:val="left"/>
+      <w:pPr>
+        <w:tabs>
+          <w:tab w:val="num" w:pos="5040"/>
+        </w:tabs>
+        <w:ind w:left="5040" w:hanging="360"/>
+      </w:pPr>
+    </w:lvl>
+    <w:lvl w:ilvl="7" w:tentative="1">
+      <w:start w:val="1"/>
+      <w:numFmt w:val="decimal"/>
+      <w:lvlText w:val="%8."/>
+      <w:lvlJc w:val="left"/>
+      <w:pPr>
+        <w:tabs>
+          <w:tab w:val="num" w:pos="5760"/>
+        </w:tabs>
+        <w:ind w:left="5760" w:hanging="360"/>
+      </w:pPr>
+    </w:lvl>
+    <w:lvl w:ilvl="8" w:tentative="1">
+      <w:start w:val="1"/>
+      <w:numFmt w:val="decimal"/>
+      <w:lvlText w:val="%9."/>
+      <w:lvlJc w:val="left"/>
+      <w:pPr>
+        <w:tabs>
+          <w:tab w:val="num" w:pos="6480"/>
+        </w:tabs>
+        <w:ind w:left="6480" w:hanging="360"/>
+      </w:pPr>
+    </w:lvl>
+  </w:abstractNum>
   <w:abstractNum w:abstractNumId="10" w15:restartNumberingAfterBreak="0">
-    <w:nsid w:val="1FDD1996"/>
+    <w:nsid w:val="2B575F3A"/>
     <w:multiLevelType w:val="multilevel"/>
-    <w:tmpl w:val="770A3B3C"/>
+    <w:tmpl w:val="E7FE7E62"/>
     <w:lvl w:ilvl="0">
       <w:start w:val="1"/>
       <w:numFmt w:val="decimal"/>
@@ -11690,9 +11690,9 @@
     </w:lvl>
   </w:abstractNum>
   <w:abstractNum w:abstractNumId="11" w15:restartNumberingAfterBreak="0">
-    <w:nsid w:val="22FE1B4B"/>
+    <w:nsid w:val="332E1BD5"/>
     <w:multiLevelType w:val="multilevel"/>
-    <w:tmpl w:val="898A15B8"/>
+    <w:tmpl w:val="FFECB7C0"/>
     <w:lvl w:ilvl="0">
       <w:start w:val="1"/>
       <w:numFmt w:val="decimal"/>
@@ -11803,9 +11803,9 @@
     </w:lvl>
   </w:abstractNum>
   <w:abstractNum w:abstractNumId="12" w15:restartNumberingAfterBreak="0">
-    <w:nsid w:val="244F1254"/>
+    <w:nsid w:val="3344008C"/>
     <w:multiLevelType w:val="multilevel"/>
-    <w:tmpl w:val="C4FEE642"/>
+    <w:tmpl w:val="2CEA55EA"/>
     <w:lvl w:ilvl="0">
       <w:start w:val="1"/>
       <w:numFmt w:val="decimal"/>
@@ -11916,461 +11916,9 @@
     </w:lvl>
   </w:abstractNum>
   <w:abstractNum w:abstractNumId="13" w15:restartNumberingAfterBreak="0">
-    <w:nsid w:val="2A535D73"/>
+    <w:nsid w:val="3C56609C"/>
     <w:multiLevelType w:val="multilevel"/>
-    <w:tmpl w:val="8ACEA104"/>
-    <w:lvl w:ilvl="0">
-      <w:start w:val="1"/>
-      <w:numFmt w:val="decimal"/>
-      <w:lvlText w:val="%1."/>
-      <w:lvlJc w:val="left"/>
-      <w:pPr>
-        <w:tabs>
-          <w:tab w:val="num" w:pos="720"/>
-        </w:tabs>
-        <w:ind w:left="720" w:hanging="360"/>
-      </w:pPr>
-    </w:lvl>
-    <w:lvl w:ilvl="1" w:tentative="1">
-      <w:start w:val="1"/>
-      <w:numFmt w:val="decimal"/>
-      <w:lvlText w:val="%2."/>
-      <w:lvlJc w:val="left"/>
-      <w:pPr>
-        <w:tabs>
-          <w:tab w:val="num" w:pos="1440"/>
-        </w:tabs>
-        <w:ind w:left="1440" w:hanging="360"/>
-      </w:pPr>
-    </w:lvl>
-    <w:lvl w:ilvl="2" w:tentative="1">
-      <w:start w:val="1"/>
-      <w:numFmt w:val="decimal"/>
-      <w:lvlText w:val="%3."/>
-      <w:lvlJc w:val="left"/>
-      <w:pPr>
-        <w:tabs>
-          <w:tab w:val="num" w:pos="2160"/>
-        </w:tabs>
-        <w:ind w:left="2160" w:hanging="360"/>
-      </w:pPr>
-    </w:lvl>
-    <w:lvl w:ilvl="3" w:tentative="1">
-      <w:start w:val="1"/>
-      <w:numFmt w:val="decimal"/>
-      <w:lvlText w:val="%4."/>
-      <w:lvlJc w:val="left"/>
-      <w:pPr>
-        <w:tabs>
-          <w:tab w:val="num" w:pos="2880"/>
-        </w:tabs>
-        <w:ind w:left="2880" w:hanging="360"/>
-      </w:pPr>
-    </w:lvl>
-    <w:lvl w:ilvl="4" w:tentative="1">
-      <w:start w:val="1"/>
-      <w:numFmt w:val="decimal"/>
-      <w:lvlText w:val="%5."/>
-      <w:lvlJc w:val="left"/>
-      <w:pPr>
-        <w:tabs>
-          <w:tab w:val="num" w:pos="3600"/>
-        </w:tabs>
-        <w:ind w:left="3600" w:hanging="360"/>
-      </w:pPr>
-    </w:lvl>
-    <w:lvl w:ilvl="5" w:tentative="1">
-      <w:start w:val="1"/>
-      <w:numFmt w:val="decimal"/>
-      <w:lvlText w:val="%6."/>
-      <w:lvlJc w:val="left"/>
-      <w:pPr>
-        <w:tabs>
-          <w:tab w:val="num" w:pos="4320"/>
-        </w:tabs>
-        <w:ind w:left="4320" w:hanging="360"/>
-      </w:pPr>
-    </w:lvl>
-    <w:lvl w:ilvl="6" w:tentative="1">
-      <w:start w:val="1"/>
-      <w:numFmt w:val="decimal"/>
-      <w:lvlText w:val="%7."/>
-      <w:lvlJc w:val="left"/>
-      <w:pPr>
-        <w:tabs>
-          <w:tab w:val="num" w:pos="5040"/>
-        </w:tabs>
-        <w:ind w:left="5040" w:hanging="360"/>
-      </w:pPr>
-    </w:lvl>
-    <w:lvl w:ilvl="7" w:tentative="1">
-      <w:start w:val="1"/>
-      <w:numFmt w:val="decimal"/>
-      <w:lvlText w:val="%8."/>
-      <w:lvlJc w:val="left"/>
-      <w:pPr>
-        <w:tabs>
-          <w:tab w:val="num" w:pos="5760"/>
-        </w:tabs>
-        <w:ind w:left="5760" w:hanging="360"/>
-      </w:pPr>
-    </w:lvl>
-    <w:lvl w:ilvl="8" w:tentative="1">
-      <w:start w:val="1"/>
-      <w:numFmt w:val="decimal"/>
-      <w:lvlText w:val="%9."/>
-      <w:lvlJc w:val="left"/>
-      <w:pPr>
-        <w:tabs>
-          <w:tab w:val="num" w:pos="6480"/>
-        </w:tabs>
-        <w:ind w:left="6480" w:hanging="360"/>
-      </w:pPr>
-    </w:lvl>
-  </w:abstractNum>
-  <w:abstractNum w:abstractNumId="14" w15:restartNumberingAfterBreak="0">
-    <w:nsid w:val="2DBD6F87"/>
-    <w:multiLevelType w:val="multilevel"/>
-    <w:tmpl w:val="AF026A30"/>
-    <w:lvl w:ilvl="0">
-      <w:start w:val="1"/>
-      <w:numFmt w:val="decimal"/>
-      <w:lvlText w:val="%1."/>
-      <w:lvlJc w:val="left"/>
-      <w:pPr>
-        <w:tabs>
-          <w:tab w:val="num" w:pos="720"/>
-        </w:tabs>
-        <w:ind w:left="720" w:hanging="360"/>
-      </w:pPr>
-    </w:lvl>
-    <w:lvl w:ilvl="1" w:tentative="1">
-      <w:start w:val="1"/>
-      <w:numFmt w:val="decimal"/>
-      <w:lvlText w:val="%2."/>
-      <w:lvlJc w:val="left"/>
-      <w:pPr>
-        <w:tabs>
-          <w:tab w:val="num" w:pos="1440"/>
-        </w:tabs>
-        <w:ind w:left="1440" w:hanging="360"/>
-      </w:pPr>
-    </w:lvl>
-    <w:lvl w:ilvl="2" w:tentative="1">
-      <w:start w:val="1"/>
-      <w:numFmt w:val="decimal"/>
-      <w:lvlText w:val="%3."/>
-      <w:lvlJc w:val="left"/>
-      <w:pPr>
-        <w:tabs>
-          <w:tab w:val="num" w:pos="2160"/>
-        </w:tabs>
-        <w:ind w:left="2160" w:hanging="360"/>
-      </w:pPr>
-    </w:lvl>
-    <w:lvl w:ilvl="3" w:tentative="1">
-      <w:start w:val="1"/>
-      <w:numFmt w:val="decimal"/>
-      <w:lvlText w:val="%4."/>
-      <w:lvlJc w:val="left"/>
-      <w:pPr>
-        <w:tabs>
-          <w:tab w:val="num" w:pos="2880"/>
-        </w:tabs>
-        <w:ind w:left="2880" w:hanging="360"/>
-      </w:pPr>
-    </w:lvl>
-    <w:lvl w:ilvl="4" w:tentative="1">
-      <w:start w:val="1"/>
-      <w:numFmt w:val="decimal"/>
-      <w:lvlText w:val="%5."/>
-      <w:lvlJc w:val="left"/>
-      <w:pPr>
-        <w:tabs>
-          <w:tab w:val="num" w:pos="3600"/>
-        </w:tabs>
-        <w:ind w:left="3600" w:hanging="360"/>
-      </w:pPr>
-    </w:lvl>
-    <w:lvl w:ilvl="5" w:tentative="1">
-      <w:start w:val="1"/>
-      <w:numFmt w:val="decimal"/>
-      <w:lvlText w:val="%6."/>
-      <w:lvlJc w:val="left"/>
-      <w:pPr>
-        <w:tabs>
-          <w:tab w:val="num" w:pos="4320"/>
-        </w:tabs>
-        <w:ind w:left="4320" w:hanging="360"/>
-      </w:pPr>
-    </w:lvl>
-    <w:lvl w:ilvl="6" w:tentative="1">
-      <w:start w:val="1"/>
-      <w:numFmt w:val="decimal"/>
-      <w:lvlText w:val="%7."/>
-      <w:lvlJc w:val="left"/>
-      <w:pPr>
-        <w:tabs>
-          <w:tab w:val="num" w:pos="5040"/>
-        </w:tabs>
-        <w:ind w:left="5040" w:hanging="360"/>
-      </w:pPr>
-    </w:lvl>
-    <w:lvl w:ilvl="7" w:tentative="1">
-      <w:start w:val="1"/>
-      <w:numFmt w:val="decimal"/>
-      <w:lvlText w:val="%8."/>
-      <w:lvlJc w:val="left"/>
-      <w:pPr>
-        <w:tabs>
-          <w:tab w:val="num" w:pos="5760"/>
-        </w:tabs>
-        <w:ind w:left="5760" w:hanging="360"/>
-      </w:pPr>
-    </w:lvl>
-    <w:lvl w:ilvl="8" w:tentative="1">
-      <w:start w:val="1"/>
-      <w:numFmt w:val="decimal"/>
-      <w:lvlText w:val="%9."/>
-      <w:lvlJc w:val="left"/>
-      <w:pPr>
-        <w:tabs>
-          <w:tab w:val="num" w:pos="6480"/>
-        </w:tabs>
-        <w:ind w:left="6480" w:hanging="360"/>
-      </w:pPr>
-    </w:lvl>
-  </w:abstractNum>
-  <w:abstractNum w:abstractNumId="15" w15:restartNumberingAfterBreak="0">
-    <w:nsid w:val="2EF64DF5"/>
-    <w:multiLevelType w:val="multilevel"/>
-    <w:tmpl w:val="D520B9B8"/>
-    <w:lvl w:ilvl="0">
-      <w:start w:val="1"/>
-      <w:numFmt w:val="decimal"/>
-      <w:lvlText w:val="%1."/>
-      <w:lvlJc w:val="left"/>
-      <w:pPr>
-        <w:tabs>
-          <w:tab w:val="num" w:pos="720"/>
-        </w:tabs>
-        <w:ind w:left="720" w:hanging="360"/>
-      </w:pPr>
-    </w:lvl>
-    <w:lvl w:ilvl="1" w:tentative="1">
-      <w:start w:val="1"/>
-      <w:numFmt w:val="decimal"/>
-      <w:lvlText w:val="%2."/>
-      <w:lvlJc w:val="left"/>
-      <w:pPr>
-        <w:tabs>
-          <w:tab w:val="num" w:pos="1440"/>
-        </w:tabs>
-        <w:ind w:left="1440" w:hanging="360"/>
-      </w:pPr>
-    </w:lvl>
-    <w:lvl w:ilvl="2" w:tentative="1">
-      <w:start w:val="1"/>
-      <w:numFmt w:val="decimal"/>
-      <w:lvlText w:val="%3."/>
-      <w:lvlJc w:val="left"/>
-      <w:pPr>
-        <w:tabs>
-          <w:tab w:val="num" w:pos="2160"/>
-        </w:tabs>
-        <w:ind w:left="2160" w:hanging="360"/>
-      </w:pPr>
-    </w:lvl>
-    <w:lvl w:ilvl="3" w:tentative="1">
-      <w:start w:val="1"/>
-      <w:numFmt w:val="decimal"/>
-      <w:lvlText w:val="%4."/>
-      <w:lvlJc w:val="left"/>
-      <w:pPr>
-        <w:tabs>
-          <w:tab w:val="num" w:pos="2880"/>
-        </w:tabs>
-        <w:ind w:left="2880" w:hanging="360"/>
-      </w:pPr>
-    </w:lvl>
-    <w:lvl w:ilvl="4" w:tentative="1">
-      <w:start w:val="1"/>
-      <w:numFmt w:val="decimal"/>
-      <w:lvlText w:val="%5."/>
-      <w:lvlJc w:val="left"/>
-      <w:pPr>
-        <w:tabs>
-          <w:tab w:val="num" w:pos="3600"/>
-        </w:tabs>
-        <w:ind w:left="3600" w:hanging="360"/>
-      </w:pPr>
-    </w:lvl>
-    <w:lvl w:ilvl="5" w:tentative="1">
-      <w:start w:val="1"/>
-      <w:numFmt w:val="decimal"/>
-      <w:lvlText w:val="%6."/>
-      <w:lvlJc w:val="left"/>
-      <w:pPr>
-        <w:tabs>
-          <w:tab w:val="num" w:pos="4320"/>
-        </w:tabs>
-        <w:ind w:left="4320" w:hanging="360"/>
-      </w:pPr>
-    </w:lvl>
-    <w:lvl w:ilvl="6" w:tentative="1">
-      <w:start w:val="1"/>
-      <w:numFmt w:val="decimal"/>
-      <w:lvlText w:val="%7."/>
-      <w:lvlJc w:val="left"/>
-      <w:pPr>
-        <w:tabs>
-          <w:tab w:val="num" w:pos="5040"/>
-        </w:tabs>
-        <w:ind w:left="5040" w:hanging="360"/>
-      </w:pPr>
-    </w:lvl>
-    <w:lvl w:ilvl="7" w:tentative="1">
-      <w:start w:val="1"/>
-      <w:numFmt w:val="decimal"/>
-      <w:lvlText w:val="%8."/>
-      <w:lvlJc w:val="left"/>
-      <w:pPr>
-        <w:tabs>
-          <w:tab w:val="num" w:pos="5760"/>
-        </w:tabs>
-        <w:ind w:left="5760" w:hanging="360"/>
-      </w:pPr>
-    </w:lvl>
-    <w:lvl w:ilvl="8" w:tentative="1">
-      <w:start w:val="1"/>
-      <w:numFmt w:val="decimal"/>
-      <w:lvlText w:val="%9."/>
-      <w:lvlJc w:val="left"/>
-      <w:pPr>
-        <w:tabs>
-          <w:tab w:val="num" w:pos="6480"/>
-        </w:tabs>
-        <w:ind w:left="6480" w:hanging="360"/>
-      </w:pPr>
-    </w:lvl>
-  </w:abstractNum>
-  <w:abstractNum w:abstractNumId="16" w15:restartNumberingAfterBreak="0">
-    <w:nsid w:val="2F8A0FB8"/>
-    <w:multiLevelType w:val="multilevel"/>
-    <w:tmpl w:val="94CA878E"/>
-    <w:lvl w:ilvl="0">
-      <w:start w:val="1"/>
-      <w:numFmt w:val="decimal"/>
-      <w:lvlText w:val="%1."/>
-      <w:lvlJc w:val="left"/>
-      <w:pPr>
-        <w:tabs>
-          <w:tab w:val="num" w:pos="720"/>
-        </w:tabs>
-        <w:ind w:left="720" w:hanging="360"/>
-      </w:pPr>
-    </w:lvl>
-    <w:lvl w:ilvl="1" w:tentative="1">
-      <w:start w:val="1"/>
-      <w:numFmt w:val="decimal"/>
-      <w:lvlText w:val="%2."/>
-      <w:lvlJc w:val="left"/>
-      <w:pPr>
-        <w:tabs>
-          <w:tab w:val="num" w:pos="1440"/>
-        </w:tabs>
-        <w:ind w:left="1440" w:hanging="360"/>
-      </w:pPr>
-    </w:lvl>
-    <w:lvl w:ilvl="2" w:tentative="1">
-      <w:start w:val="1"/>
-      <w:numFmt w:val="decimal"/>
-      <w:lvlText w:val="%3."/>
-      <w:lvlJc w:val="left"/>
-      <w:pPr>
-        <w:tabs>
-          <w:tab w:val="num" w:pos="2160"/>
-        </w:tabs>
-        <w:ind w:left="2160" w:hanging="360"/>
-      </w:pPr>
-    </w:lvl>
-    <w:lvl w:ilvl="3" w:tentative="1">
-      <w:start w:val="1"/>
-      <w:numFmt w:val="decimal"/>
-      <w:lvlText w:val="%4."/>
-      <w:lvlJc w:val="left"/>
-      <w:pPr>
-        <w:tabs>
-          <w:tab w:val="num" w:pos="2880"/>
-        </w:tabs>
-        <w:ind w:left="2880" w:hanging="360"/>
-      </w:pPr>
-    </w:lvl>
-    <w:lvl w:ilvl="4" w:tentative="1">
-      <w:start w:val="1"/>
-      <w:numFmt w:val="decimal"/>
-      <w:lvlText w:val="%5."/>
-      <w:lvlJc w:val="left"/>
-      <w:pPr>
-        <w:tabs>
-          <w:tab w:val="num" w:pos="3600"/>
-        </w:tabs>
-        <w:ind w:left="3600" w:hanging="360"/>
-      </w:pPr>
-    </w:lvl>
-    <w:lvl w:ilvl="5" w:tentative="1">
-      <w:start w:val="1"/>
-      <w:numFmt w:val="decimal"/>
-      <w:lvlText w:val="%6."/>
-      <w:lvlJc w:val="left"/>
-      <w:pPr>
-        <w:tabs>
-          <w:tab w:val="num" w:pos="4320"/>
-        </w:tabs>
-        <w:ind w:left="4320" w:hanging="360"/>
-      </w:pPr>
-    </w:lvl>
-    <w:lvl w:ilvl="6" w:tentative="1">
-      <w:start w:val="1"/>
-      <w:numFmt w:val="decimal"/>
-      <w:lvlText w:val="%7."/>
-      <w:lvlJc w:val="left"/>
-      <w:pPr>
-        <w:tabs>
-          <w:tab w:val="num" w:pos="5040"/>
-        </w:tabs>
-        <w:ind w:left="5040" w:hanging="360"/>
-      </w:pPr>
-    </w:lvl>
-    <w:lvl w:ilvl="7" w:tentative="1">
-      <w:start w:val="1"/>
-      <w:numFmt w:val="decimal"/>
-      <w:lvlText w:val="%8."/>
-      <w:lvlJc w:val="left"/>
-      <w:pPr>
-        <w:tabs>
-          <w:tab w:val="num" w:pos="5760"/>
-        </w:tabs>
-        <w:ind w:left="5760" w:hanging="360"/>
-      </w:pPr>
-    </w:lvl>
-    <w:lvl w:ilvl="8" w:tentative="1">
-      <w:start w:val="1"/>
-      <w:numFmt w:val="decimal"/>
-      <w:lvlText w:val="%9."/>
-      <w:lvlJc w:val="left"/>
-      <w:pPr>
-        <w:tabs>
-          <w:tab w:val="num" w:pos="6480"/>
-        </w:tabs>
-        <w:ind w:left="6480" w:hanging="360"/>
-      </w:pPr>
-    </w:lvl>
-  </w:abstractNum>
-  <w:abstractNum w:abstractNumId="17" w15:restartNumberingAfterBreak="0">
-    <w:nsid w:val="3135084B"/>
-    <w:multiLevelType w:val="multilevel"/>
-    <w:tmpl w:val="CB58930C"/>
+    <w:tmpl w:val="34EEDBDC"/>
     <w:lvl w:ilvl="0">
       <w:start w:val="1"/>
       <w:numFmt w:val="bullet"/>
@@ -12516,10 +12064,10 @@
       </w:rPr>
     </w:lvl>
   </w:abstractNum>
-  <w:abstractNum w:abstractNumId="18" w15:restartNumberingAfterBreak="0">
-    <w:nsid w:val="47930B87"/>
+  <w:abstractNum w:abstractNumId="14" w15:restartNumberingAfterBreak="0">
+    <w:nsid w:val="3DF34C77"/>
     <w:multiLevelType w:val="multilevel"/>
-    <w:tmpl w:val="F22AD91C"/>
+    <w:tmpl w:val="4D10BB7E"/>
     <w:lvl w:ilvl="0">
       <w:start w:val="1"/>
       <w:numFmt w:val="decimal"/>
@@ -12629,349 +12177,10 @@
       </w:pPr>
     </w:lvl>
   </w:abstractNum>
-  <w:abstractNum w:abstractNumId="19" w15:restartNumberingAfterBreak="0">
-    <w:nsid w:val="49D41691"/>
+  <w:abstractNum w:abstractNumId="15" w15:restartNumberingAfterBreak="0">
+    <w:nsid w:val="3F2D6583"/>
     <w:multiLevelType w:val="multilevel"/>
-    <w:tmpl w:val="D1540EA2"/>
-    <w:lvl w:ilvl="0">
-      <w:start w:val="1"/>
-      <w:numFmt w:val="decimal"/>
-      <w:lvlText w:val="%1."/>
-      <w:lvlJc w:val="left"/>
-      <w:pPr>
-        <w:tabs>
-          <w:tab w:val="num" w:pos="720"/>
-        </w:tabs>
-        <w:ind w:left="720" w:hanging="360"/>
-      </w:pPr>
-    </w:lvl>
-    <w:lvl w:ilvl="1" w:tentative="1">
-      <w:start w:val="1"/>
-      <w:numFmt w:val="decimal"/>
-      <w:lvlText w:val="%2."/>
-      <w:lvlJc w:val="left"/>
-      <w:pPr>
-        <w:tabs>
-          <w:tab w:val="num" w:pos="1440"/>
-        </w:tabs>
-        <w:ind w:left="1440" w:hanging="360"/>
-      </w:pPr>
-    </w:lvl>
-    <w:lvl w:ilvl="2" w:tentative="1">
-      <w:start w:val="1"/>
-      <w:numFmt w:val="decimal"/>
-      <w:lvlText w:val="%3."/>
-      <w:lvlJc w:val="left"/>
-      <w:pPr>
-        <w:tabs>
-          <w:tab w:val="num" w:pos="2160"/>
-        </w:tabs>
-        <w:ind w:left="2160" w:hanging="360"/>
-      </w:pPr>
-    </w:lvl>
-    <w:lvl w:ilvl="3" w:tentative="1">
-      <w:start w:val="1"/>
-      <w:numFmt w:val="decimal"/>
-      <w:lvlText w:val="%4."/>
-      <w:lvlJc w:val="left"/>
-      <w:pPr>
-        <w:tabs>
-          <w:tab w:val="num" w:pos="2880"/>
-        </w:tabs>
-        <w:ind w:left="2880" w:hanging="360"/>
-      </w:pPr>
-    </w:lvl>
-    <w:lvl w:ilvl="4" w:tentative="1">
-      <w:start w:val="1"/>
-      <w:numFmt w:val="decimal"/>
-      <w:lvlText w:val="%5."/>
-      <w:lvlJc w:val="left"/>
-      <w:pPr>
-        <w:tabs>
-          <w:tab w:val="num" w:pos="3600"/>
-        </w:tabs>
-        <w:ind w:left="3600" w:hanging="360"/>
-      </w:pPr>
-    </w:lvl>
-    <w:lvl w:ilvl="5" w:tentative="1">
-      <w:start w:val="1"/>
-      <w:numFmt w:val="decimal"/>
-      <w:lvlText w:val="%6."/>
-      <w:lvlJc w:val="left"/>
-      <w:pPr>
-        <w:tabs>
-          <w:tab w:val="num" w:pos="4320"/>
-        </w:tabs>
-        <w:ind w:left="4320" w:hanging="360"/>
-      </w:pPr>
-    </w:lvl>
-    <w:lvl w:ilvl="6" w:tentative="1">
-      <w:start w:val="1"/>
-      <w:numFmt w:val="decimal"/>
-      <w:lvlText w:val="%7."/>
-      <w:lvlJc w:val="left"/>
-      <w:pPr>
-        <w:tabs>
-          <w:tab w:val="num" w:pos="5040"/>
-        </w:tabs>
-        <w:ind w:left="5040" w:hanging="360"/>
-      </w:pPr>
-    </w:lvl>
-    <w:lvl w:ilvl="7" w:tentative="1">
-      <w:start w:val="1"/>
-      <w:numFmt w:val="decimal"/>
-      <w:lvlText w:val="%8."/>
-      <w:lvlJc w:val="left"/>
-      <w:pPr>
-        <w:tabs>
-          <w:tab w:val="num" w:pos="5760"/>
-        </w:tabs>
-        <w:ind w:left="5760" w:hanging="360"/>
-      </w:pPr>
-    </w:lvl>
-    <w:lvl w:ilvl="8" w:tentative="1">
-      <w:start w:val="1"/>
-      <w:numFmt w:val="decimal"/>
-      <w:lvlText w:val="%9."/>
-      <w:lvlJc w:val="left"/>
-      <w:pPr>
-        <w:tabs>
-          <w:tab w:val="num" w:pos="6480"/>
-        </w:tabs>
-        <w:ind w:left="6480" w:hanging="360"/>
-      </w:pPr>
-    </w:lvl>
-  </w:abstractNum>
-  <w:abstractNum w:abstractNumId="20" w15:restartNumberingAfterBreak="0">
-    <w:nsid w:val="4BE26A20"/>
-    <w:multiLevelType w:val="multilevel"/>
-    <w:tmpl w:val="186EB54C"/>
-    <w:lvl w:ilvl="0">
-      <w:start w:val="1"/>
-      <w:numFmt w:val="decimal"/>
-      <w:lvlText w:val="%1."/>
-      <w:lvlJc w:val="left"/>
-      <w:pPr>
-        <w:tabs>
-          <w:tab w:val="num" w:pos="720"/>
-        </w:tabs>
-        <w:ind w:left="720" w:hanging="360"/>
-      </w:pPr>
-    </w:lvl>
-    <w:lvl w:ilvl="1" w:tentative="1">
-      <w:start w:val="1"/>
-      <w:numFmt w:val="decimal"/>
-      <w:lvlText w:val="%2."/>
-      <w:lvlJc w:val="left"/>
-      <w:pPr>
-        <w:tabs>
-          <w:tab w:val="num" w:pos="1440"/>
-        </w:tabs>
-        <w:ind w:left="1440" w:hanging="360"/>
-      </w:pPr>
-    </w:lvl>
-    <w:lvl w:ilvl="2" w:tentative="1">
-      <w:start w:val="1"/>
-      <w:numFmt w:val="decimal"/>
-      <w:lvlText w:val="%3."/>
-      <w:lvlJc w:val="left"/>
-      <w:pPr>
-        <w:tabs>
-          <w:tab w:val="num" w:pos="2160"/>
-        </w:tabs>
-        <w:ind w:left="2160" w:hanging="360"/>
-      </w:pPr>
-    </w:lvl>
-    <w:lvl w:ilvl="3" w:tentative="1">
-      <w:start w:val="1"/>
-      <w:numFmt w:val="decimal"/>
-      <w:lvlText w:val="%4."/>
-      <w:lvlJc w:val="left"/>
-      <w:pPr>
-        <w:tabs>
-          <w:tab w:val="num" w:pos="2880"/>
-        </w:tabs>
-        <w:ind w:left="2880" w:hanging="360"/>
-      </w:pPr>
-    </w:lvl>
-    <w:lvl w:ilvl="4" w:tentative="1">
-      <w:start w:val="1"/>
-      <w:numFmt w:val="decimal"/>
-      <w:lvlText w:val="%5."/>
-      <w:lvlJc w:val="left"/>
-      <w:pPr>
-        <w:tabs>
-          <w:tab w:val="num" w:pos="3600"/>
-        </w:tabs>
-        <w:ind w:left="3600" w:hanging="360"/>
-      </w:pPr>
-    </w:lvl>
-    <w:lvl w:ilvl="5" w:tentative="1">
-      <w:start w:val="1"/>
-      <w:numFmt w:val="decimal"/>
-      <w:lvlText w:val="%6."/>
-      <w:lvlJc w:val="left"/>
-      <w:pPr>
-        <w:tabs>
-          <w:tab w:val="num" w:pos="4320"/>
-        </w:tabs>
-        <w:ind w:left="4320" w:hanging="360"/>
-      </w:pPr>
-    </w:lvl>
-    <w:lvl w:ilvl="6" w:tentative="1">
-      <w:start w:val="1"/>
-      <w:numFmt w:val="decimal"/>
-      <w:lvlText w:val="%7."/>
-      <w:lvlJc w:val="left"/>
-      <w:pPr>
-        <w:tabs>
-          <w:tab w:val="num" w:pos="5040"/>
-        </w:tabs>
-        <w:ind w:left="5040" w:hanging="360"/>
-      </w:pPr>
-    </w:lvl>
-    <w:lvl w:ilvl="7" w:tentative="1">
-      <w:start w:val="1"/>
-      <w:numFmt w:val="decimal"/>
-      <w:lvlText w:val="%8."/>
-      <w:lvlJc w:val="left"/>
-      <w:pPr>
-        <w:tabs>
-          <w:tab w:val="num" w:pos="5760"/>
-        </w:tabs>
-        <w:ind w:left="5760" w:hanging="360"/>
-      </w:pPr>
-    </w:lvl>
-    <w:lvl w:ilvl="8" w:tentative="1">
-      <w:start w:val="1"/>
-      <w:numFmt w:val="decimal"/>
-      <w:lvlText w:val="%9."/>
-      <w:lvlJc w:val="left"/>
-      <w:pPr>
-        <w:tabs>
-          <w:tab w:val="num" w:pos="6480"/>
-        </w:tabs>
-        <w:ind w:left="6480" w:hanging="360"/>
-      </w:pPr>
-    </w:lvl>
-  </w:abstractNum>
-  <w:abstractNum w:abstractNumId="21" w15:restartNumberingAfterBreak="0">
-    <w:nsid w:val="4DD93D06"/>
-    <w:multiLevelType w:val="multilevel"/>
-    <w:tmpl w:val="877047BA"/>
-    <w:lvl w:ilvl="0">
-      <w:start w:val="1"/>
-      <w:numFmt w:val="decimal"/>
-      <w:lvlText w:val="%1."/>
-      <w:lvlJc w:val="left"/>
-      <w:pPr>
-        <w:tabs>
-          <w:tab w:val="num" w:pos="720"/>
-        </w:tabs>
-        <w:ind w:left="720" w:hanging="360"/>
-      </w:pPr>
-    </w:lvl>
-    <w:lvl w:ilvl="1" w:tentative="1">
-      <w:start w:val="1"/>
-      <w:numFmt w:val="decimal"/>
-      <w:lvlText w:val="%2."/>
-      <w:lvlJc w:val="left"/>
-      <w:pPr>
-        <w:tabs>
-          <w:tab w:val="num" w:pos="1440"/>
-        </w:tabs>
-        <w:ind w:left="1440" w:hanging="360"/>
-      </w:pPr>
-    </w:lvl>
-    <w:lvl w:ilvl="2" w:tentative="1">
-      <w:start w:val="1"/>
-      <w:numFmt w:val="decimal"/>
-      <w:lvlText w:val="%3."/>
-      <w:lvlJc w:val="left"/>
-      <w:pPr>
-        <w:tabs>
-          <w:tab w:val="num" w:pos="2160"/>
-        </w:tabs>
-        <w:ind w:left="2160" w:hanging="360"/>
-      </w:pPr>
-    </w:lvl>
-    <w:lvl w:ilvl="3" w:tentative="1">
-      <w:start w:val="1"/>
-      <w:numFmt w:val="decimal"/>
-      <w:lvlText w:val="%4."/>
-      <w:lvlJc w:val="left"/>
-      <w:pPr>
-        <w:tabs>
-          <w:tab w:val="num" w:pos="2880"/>
-        </w:tabs>
-        <w:ind w:left="2880" w:hanging="360"/>
-      </w:pPr>
-    </w:lvl>
-    <w:lvl w:ilvl="4" w:tentative="1">
-      <w:start w:val="1"/>
-      <w:numFmt w:val="decimal"/>
-      <w:lvlText w:val="%5."/>
-      <w:lvlJc w:val="left"/>
-      <w:pPr>
-        <w:tabs>
-          <w:tab w:val="num" w:pos="3600"/>
-        </w:tabs>
-        <w:ind w:left="3600" w:hanging="360"/>
-      </w:pPr>
-    </w:lvl>
-    <w:lvl w:ilvl="5" w:tentative="1">
-      <w:start w:val="1"/>
-      <w:numFmt w:val="decimal"/>
-      <w:lvlText w:val="%6."/>
-      <w:lvlJc w:val="left"/>
-      <w:pPr>
-        <w:tabs>
-          <w:tab w:val="num" w:pos="4320"/>
-        </w:tabs>
-        <w:ind w:left="4320" w:hanging="360"/>
-      </w:pPr>
-    </w:lvl>
-    <w:lvl w:ilvl="6" w:tentative="1">
-      <w:start w:val="1"/>
-      <w:numFmt w:val="decimal"/>
-      <w:lvlText w:val="%7."/>
-      <w:lvlJc w:val="left"/>
-      <w:pPr>
-        <w:tabs>
-          <w:tab w:val="num" w:pos="5040"/>
-        </w:tabs>
-        <w:ind w:left="5040" w:hanging="360"/>
-      </w:pPr>
-    </w:lvl>
-    <w:lvl w:ilvl="7" w:tentative="1">
-      <w:start w:val="1"/>
-      <w:numFmt w:val="decimal"/>
-      <w:lvlText w:val="%8."/>
-      <w:lvlJc w:val="left"/>
-      <w:pPr>
-        <w:tabs>
-          <w:tab w:val="num" w:pos="5760"/>
-        </w:tabs>
-        <w:ind w:left="5760" w:hanging="360"/>
-      </w:pPr>
-    </w:lvl>
-    <w:lvl w:ilvl="8" w:tentative="1">
-      <w:start w:val="1"/>
-      <w:numFmt w:val="decimal"/>
-      <w:lvlText w:val="%9."/>
-      <w:lvlJc w:val="left"/>
-      <w:pPr>
-        <w:tabs>
-          <w:tab w:val="num" w:pos="6480"/>
-        </w:tabs>
-        <w:ind w:left="6480" w:hanging="360"/>
-      </w:pPr>
-    </w:lvl>
-  </w:abstractNum>
-  <w:abstractNum w:abstractNumId="22" w15:restartNumberingAfterBreak="0">
-    <w:nsid w:val="4DF45604"/>
-    <w:multiLevelType w:val="multilevel"/>
-    <w:tmpl w:val="57944358"/>
+    <w:tmpl w:val="4E7451AE"/>
     <w:lvl w:ilvl="0">
       <w:start w:val="1"/>
       <w:numFmt w:val="bullet"/>
@@ -13117,10 +12326,236 @@
       </w:rPr>
     </w:lvl>
   </w:abstractNum>
-  <w:abstractNum w:abstractNumId="23" w15:restartNumberingAfterBreak="0">
-    <w:nsid w:val="551C67EE"/>
+  <w:abstractNum w:abstractNumId="16" w15:restartNumberingAfterBreak="0">
+    <w:nsid w:val="4A334188"/>
     <w:multiLevelType w:val="multilevel"/>
-    <w:tmpl w:val="E4E6D94A"/>
+    <w:tmpl w:val="96FE185E"/>
+    <w:lvl w:ilvl="0">
+      <w:start w:val="1"/>
+      <w:numFmt w:val="decimal"/>
+      <w:lvlText w:val="%1."/>
+      <w:lvlJc w:val="left"/>
+      <w:pPr>
+        <w:tabs>
+          <w:tab w:val="num" w:pos="720"/>
+        </w:tabs>
+        <w:ind w:left="720" w:hanging="360"/>
+      </w:pPr>
+    </w:lvl>
+    <w:lvl w:ilvl="1" w:tentative="1">
+      <w:start w:val="1"/>
+      <w:numFmt w:val="decimal"/>
+      <w:lvlText w:val="%2."/>
+      <w:lvlJc w:val="left"/>
+      <w:pPr>
+        <w:tabs>
+          <w:tab w:val="num" w:pos="1440"/>
+        </w:tabs>
+        <w:ind w:left="1440" w:hanging="360"/>
+      </w:pPr>
+    </w:lvl>
+    <w:lvl w:ilvl="2" w:tentative="1">
+      <w:start w:val="1"/>
+      <w:numFmt w:val="decimal"/>
+      <w:lvlText w:val="%3."/>
+      <w:lvlJc w:val="left"/>
+      <w:pPr>
+        <w:tabs>
+          <w:tab w:val="num" w:pos="2160"/>
+        </w:tabs>
+        <w:ind w:left="2160" w:hanging="360"/>
+      </w:pPr>
+    </w:lvl>
+    <w:lvl w:ilvl="3" w:tentative="1">
+      <w:start w:val="1"/>
+      <w:numFmt w:val="decimal"/>
+      <w:lvlText w:val="%4."/>
+      <w:lvlJc w:val="left"/>
+      <w:pPr>
+        <w:tabs>
+          <w:tab w:val="num" w:pos="2880"/>
+        </w:tabs>
+        <w:ind w:left="2880" w:hanging="360"/>
+      </w:pPr>
+    </w:lvl>
+    <w:lvl w:ilvl="4" w:tentative="1">
+      <w:start w:val="1"/>
+      <w:numFmt w:val="decimal"/>
+      <w:lvlText w:val="%5."/>
+      <w:lvlJc w:val="left"/>
+      <w:pPr>
+        <w:tabs>
+          <w:tab w:val="num" w:pos="3600"/>
+        </w:tabs>
+        <w:ind w:left="3600" w:hanging="360"/>
+      </w:pPr>
+    </w:lvl>
+    <w:lvl w:ilvl="5" w:tentative="1">
+      <w:start w:val="1"/>
+      <w:numFmt w:val="decimal"/>
+      <w:lvlText w:val="%6."/>
+      <w:lvlJc w:val="left"/>
+      <w:pPr>
+        <w:tabs>
+          <w:tab w:val="num" w:pos="4320"/>
+        </w:tabs>
+        <w:ind w:left="4320" w:hanging="360"/>
+      </w:pPr>
+    </w:lvl>
+    <w:lvl w:ilvl="6" w:tentative="1">
+      <w:start w:val="1"/>
+      <w:numFmt w:val="decimal"/>
+      <w:lvlText w:val="%7."/>
+      <w:lvlJc w:val="left"/>
+      <w:pPr>
+        <w:tabs>
+          <w:tab w:val="num" w:pos="5040"/>
+        </w:tabs>
+        <w:ind w:left="5040" w:hanging="360"/>
+      </w:pPr>
+    </w:lvl>
+    <w:lvl w:ilvl="7" w:tentative="1">
+      <w:start w:val="1"/>
+      <w:numFmt w:val="decimal"/>
+      <w:lvlText w:val="%8."/>
+      <w:lvlJc w:val="left"/>
+      <w:pPr>
+        <w:tabs>
+          <w:tab w:val="num" w:pos="5760"/>
+        </w:tabs>
+        <w:ind w:left="5760" w:hanging="360"/>
+      </w:pPr>
+    </w:lvl>
+    <w:lvl w:ilvl="8" w:tentative="1">
+      <w:start w:val="1"/>
+      <w:numFmt w:val="decimal"/>
+      <w:lvlText w:val="%9."/>
+      <w:lvlJc w:val="left"/>
+      <w:pPr>
+        <w:tabs>
+          <w:tab w:val="num" w:pos="6480"/>
+        </w:tabs>
+        <w:ind w:left="6480" w:hanging="360"/>
+      </w:pPr>
+    </w:lvl>
+  </w:abstractNum>
+  <w:abstractNum w:abstractNumId="17" w15:restartNumberingAfterBreak="0">
+    <w:nsid w:val="4A3A6239"/>
+    <w:multiLevelType w:val="multilevel"/>
+    <w:tmpl w:val="049E97C6"/>
+    <w:lvl w:ilvl="0">
+      <w:start w:val="1"/>
+      <w:numFmt w:val="decimal"/>
+      <w:lvlText w:val="%1."/>
+      <w:lvlJc w:val="left"/>
+      <w:pPr>
+        <w:tabs>
+          <w:tab w:val="num" w:pos="720"/>
+        </w:tabs>
+        <w:ind w:left="720" w:hanging="360"/>
+      </w:pPr>
+    </w:lvl>
+    <w:lvl w:ilvl="1" w:tentative="1">
+      <w:start w:val="1"/>
+      <w:numFmt w:val="decimal"/>
+      <w:lvlText w:val="%2."/>
+      <w:lvlJc w:val="left"/>
+      <w:pPr>
+        <w:tabs>
+          <w:tab w:val="num" w:pos="1440"/>
+        </w:tabs>
+        <w:ind w:left="1440" w:hanging="360"/>
+      </w:pPr>
+    </w:lvl>
+    <w:lvl w:ilvl="2" w:tentative="1">
+      <w:start w:val="1"/>
+      <w:numFmt w:val="decimal"/>
+      <w:lvlText w:val="%3."/>
+      <w:lvlJc w:val="left"/>
+      <w:pPr>
+        <w:tabs>
+          <w:tab w:val="num" w:pos="2160"/>
+        </w:tabs>
+        <w:ind w:left="2160" w:hanging="360"/>
+      </w:pPr>
+    </w:lvl>
+    <w:lvl w:ilvl="3" w:tentative="1">
+      <w:start w:val="1"/>
+      <w:numFmt w:val="decimal"/>
+      <w:lvlText w:val="%4."/>
+      <w:lvlJc w:val="left"/>
+      <w:pPr>
+        <w:tabs>
+          <w:tab w:val="num" w:pos="2880"/>
+        </w:tabs>
+        <w:ind w:left="2880" w:hanging="360"/>
+      </w:pPr>
+    </w:lvl>
+    <w:lvl w:ilvl="4" w:tentative="1">
+      <w:start w:val="1"/>
+      <w:numFmt w:val="decimal"/>
+      <w:lvlText w:val="%5."/>
+      <w:lvlJc w:val="left"/>
+      <w:pPr>
+        <w:tabs>
+          <w:tab w:val="num" w:pos="3600"/>
+        </w:tabs>
+        <w:ind w:left="3600" w:hanging="360"/>
+      </w:pPr>
+    </w:lvl>
+    <w:lvl w:ilvl="5" w:tentative="1">
+      <w:start w:val="1"/>
+      <w:numFmt w:val="decimal"/>
+      <w:lvlText w:val="%6."/>
+      <w:lvlJc w:val="left"/>
+      <w:pPr>
+        <w:tabs>
+          <w:tab w:val="num" w:pos="4320"/>
+        </w:tabs>
+        <w:ind w:left="4320" w:hanging="360"/>
+      </w:pPr>
+    </w:lvl>
+    <w:lvl w:ilvl="6" w:tentative="1">
+      <w:start w:val="1"/>
+      <w:numFmt w:val="decimal"/>
+      <w:lvlText w:val="%7."/>
+      <w:lvlJc w:val="left"/>
+      <w:pPr>
+        <w:tabs>
+          <w:tab w:val="num" w:pos="5040"/>
+        </w:tabs>
+        <w:ind w:left="5040" w:hanging="360"/>
+      </w:pPr>
+    </w:lvl>
+    <w:lvl w:ilvl="7" w:tentative="1">
+      <w:start w:val="1"/>
+      <w:numFmt w:val="decimal"/>
+      <w:lvlText w:val="%8."/>
+      <w:lvlJc w:val="left"/>
+      <w:pPr>
+        <w:tabs>
+          <w:tab w:val="num" w:pos="5760"/>
+        </w:tabs>
+        <w:ind w:left="5760" w:hanging="360"/>
+      </w:pPr>
+    </w:lvl>
+    <w:lvl w:ilvl="8" w:tentative="1">
+      <w:start w:val="1"/>
+      <w:numFmt w:val="decimal"/>
+      <w:lvlText w:val="%9."/>
+      <w:lvlJc w:val="left"/>
+      <w:pPr>
+        <w:tabs>
+          <w:tab w:val="num" w:pos="6480"/>
+        </w:tabs>
+        <w:ind w:left="6480" w:hanging="360"/>
+      </w:pPr>
+    </w:lvl>
+  </w:abstractNum>
+  <w:abstractNum w:abstractNumId="18" w15:restartNumberingAfterBreak="0">
+    <w:nsid w:val="4AD752C7"/>
+    <w:multiLevelType w:val="multilevel"/>
+    <w:tmpl w:val="C67292FA"/>
     <w:lvl w:ilvl="0">
       <w:start w:val="1"/>
       <w:numFmt w:val="bullet"/>
@@ -13266,236 +12701,10 @@
       </w:rPr>
     </w:lvl>
   </w:abstractNum>
-  <w:abstractNum w:abstractNumId="24" w15:restartNumberingAfterBreak="0">
-    <w:nsid w:val="557A6152"/>
+  <w:abstractNum w:abstractNumId="19" w15:restartNumberingAfterBreak="0">
+    <w:nsid w:val="4B1B1F6D"/>
     <w:multiLevelType w:val="multilevel"/>
-    <w:tmpl w:val="8872071A"/>
-    <w:lvl w:ilvl="0">
-      <w:start w:val="1"/>
-      <w:numFmt w:val="decimal"/>
-      <w:lvlText w:val="%1."/>
-      <w:lvlJc w:val="left"/>
-      <w:pPr>
-        <w:tabs>
-          <w:tab w:val="num" w:pos="720"/>
-        </w:tabs>
-        <w:ind w:left="720" w:hanging="360"/>
-      </w:pPr>
-    </w:lvl>
-    <w:lvl w:ilvl="1" w:tentative="1">
-      <w:start w:val="1"/>
-      <w:numFmt w:val="decimal"/>
-      <w:lvlText w:val="%2."/>
-      <w:lvlJc w:val="left"/>
-      <w:pPr>
-        <w:tabs>
-          <w:tab w:val="num" w:pos="1440"/>
-        </w:tabs>
-        <w:ind w:left="1440" w:hanging="360"/>
-      </w:pPr>
-    </w:lvl>
-    <w:lvl w:ilvl="2" w:tentative="1">
-      <w:start w:val="1"/>
-      <w:numFmt w:val="decimal"/>
-      <w:lvlText w:val="%3."/>
-      <w:lvlJc w:val="left"/>
-      <w:pPr>
-        <w:tabs>
-          <w:tab w:val="num" w:pos="2160"/>
-        </w:tabs>
-        <w:ind w:left="2160" w:hanging="360"/>
-      </w:pPr>
-    </w:lvl>
-    <w:lvl w:ilvl="3" w:tentative="1">
-      <w:start w:val="1"/>
-      <w:numFmt w:val="decimal"/>
-      <w:lvlText w:val="%4."/>
-      <w:lvlJc w:val="left"/>
-      <w:pPr>
-        <w:tabs>
-          <w:tab w:val="num" w:pos="2880"/>
-        </w:tabs>
-        <w:ind w:left="2880" w:hanging="360"/>
-      </w:pPr>
-    </w:lvl>
-    <w:lvl w:ilvl="4" w:tentative="1">
-      <w:start w:val="1"/>
-      <w:numFmt w:val="decimal"/>
-      <w:lvlText w:val="%5."/>
-      <w:lvlJc w:val="left"/>
-      <w:pPr>
-        <w:tabs>
-          <w:tab w:val="num" w:pos="3600"/>
-        </w:tabs>
-        <w:ind w:left="3600" w:hanging="360"/>
-      </w:pPr>
-    </w:lvl>
-    <w:lvl w:ilvl="5" w:tentative="1">
-      <w:start w:val="1"/>
-      <w:numFmt w:val="decimal"/>
-      <w:lvlText w:val="%6."/>
-      <w:lvlJc w:val="left"/>
-      <w:pPr>
-        <w:tabs>
-          <w:tab w:val="num" w:pos="4320"/>
-        </w:tabs>
-        <w:ind w:left="4320" w:hanging="360"/>
-      </w:pPr>
-    </w:lvl>
-    <w:lvl w:ilvl="6" w:tentative="1">
-      <w:start w:val="1"/>
-      <w:numFmt w:val="decimal"/>
-      <w:lvlText w:val="%7."/>
-      <w:lvlJc w:val="left"/>
-      <w:pPr>
-        <w:tabs>
-          <w:tab w:val="num" w:pos="5040"/>
-        </w:tabs>
-        <w:ind w:left="5040" w:hanging="360"/>
-      </w:pPr>
-    </w:lvl>
-    <w:lvl w:ilvl="7" w:tentative="1">
-      <w:start w:val="1"/>
-      <w:numFmt w:val="decimal"/>
-      <w:lvlText w:val="%8."/>
-      <w:lvlJc w:val="left"/>
-      <w:pPr>
-        <w:tabs>
-          <w:tab w:val="num" w:pos="5760"/>
-        </w:tabs>
-        <w:ind w:left="5760" w:hanging="360"/>
-      </w:pPr>
-    </w:lvl>
-    <w:lvl w:ilvl="8" w:tentative="1">
-      <w:start w:val="1"/>
-      <w:numFmt w:val="decimal"/>
-      <w:lvlText w:val="%9."/>
-      <w:lvlJc w:val="left"/>
-      <w:pPr>
-        <w:tabs>
-          <w:tab w:val="num" w:pos="6480"/>
-        </w:tabs>
-        <w:ind w:left="6480" w:hanging="360"/>
-      </w:pPr>
-    </w:lvl>
-  </w:abstractNum>
-  <w:abstractNum w:abstractNumId="25" w15:restartNumberingAfterBreak="0">
-    <w:nsid w:val="5AB06ACE"/>
-    <w:multiLevelType w:val="multilevel"/>
-    <w:tmpl w:val="3B2454B4"/>
-    <w:lvl w:ilvl="0">
-      <w:start w:val="1"/>
-      <w:numFmt w:val="decimal"/>
-      <w:lvlText w:val="%1."/>
-      <w:lvlJc w:val="left"/>
-      <w:pPr>
-        <w:tabs>
-          <w:tab w:val="num" w:pos="720"/>
-        </w:tabs>
-        <w:ind w:left="720" w:hanging="360"/>
-      </w:pPr>
-    </w:lvl>
-    <w:lvl w:ilvl="1" w:tentative="1">
-      <w:start w:val="1"/>
-      <w:numFmt w:val="decimal"/>
-      <w:lvlText w:val="%2."/>
-      <w:lvlJc w:val="left"/>
-      <w:pPr>
-        <w:tabs>
-          <w:tab w:val="num" w:pos="1440"/>
-        </w:tabs>
-        <w:ind w:left="1440" w:hanging="360"/>
-      </w:pPr>
-    </w:lvl>
-    <w:lvl w:ilvl="2" w:tentative="1">
-      <w:start w:val="1"/>
-      <w:numFmt w:val="decimal"/>
-      <w:lvlText w:val="%3."/>
-      <w:lvlJc w:val="left"/>
-      <w:pPr>
-        <w:tabs>
-          <w:tab w:val="num" w:pos="2160"/>
-        </w:tabs>
-        <w:ind w:left="2160" w:hanging="360"/>
-      </w:pPr>
-    </w:lvl>
-    <w:lvl w:ilvl="3" w:tentative="1">
-      <w:start w:val="1"/>
-      <w:numFmt w:val="decimal"/>
-      <w:lvlText w:val="%4."/>
-      <w:lvlJc w:val="left"/>
-      <w:pPr>
-        <w:tabs>
-          <w:tab w:val="num" w:pos="2880"/>
-        </w:tabs>
-        <w:ind w:left="2880" w:hanging="360"/>
-      </w:pPr>
-    </w:lvl>
-    <w:lvl w:ilvl="4" w:tentative="1">
-      <w:start w:val="1"/>
-      <w:numFmt w:val="decimal"/>
-      <w:lvlText w:val="%5."/>
-      <w:lvlJc w:val="left"/>
-      <w:pPr>
-        <w:tabs>
-          <w:tab w:val="num" w:pos="3600"/>
-        </w:tabs>
-        <w:ind w:left="3600" w:hanging="360"/>
-      </w:pPr>
-    </w:lvl>
-    <w:lvl w:ilvl="5" w:tentative="1">
-      <w:start w:val="1"/>
-      <w:numFmt w:val="decimal"/>
-      <w:lvlText w:val="%6."/>
-      <w:lvlJc w:val="left"/>
-      <w:pPr>
-        <w:tabs>
-          <w:tab w:val="num" w:pos="4320"/>
-        </w:tabs>
-        <w:ind w:left="4320" w:hanging="360"/>
-      </w:pPr>
-    </w:lvl>
-    <w:lvl w:ilvl="6" w:tentative="1">
-      <w:start w:val="1"/>
-      <w:numFmt w:val="decimal"/>
-      <w:lvlText w:val="%7."/>
-      <w:lvlJc w:val="left"/>
-      <w:pPr>
-        <w:tabs>
-          <w:tab w:val="num" w:pos="5040"/>
-        </w:tabs>
-        <w:ind w:left="5040" w:hanging="360"/>
-      </w:pPr>
-    </w:lvl>
-    <w:lvl w:ilvl="7" w:tentative="1">
-      <w:start w:val="1"/>
-      <w:numFmt w:val="decimal"/>
-      <w:lvlText w:val="%8."/>
-      <w:lvlJc w:val="left"/>
-      <w:pPr>
-        <w:tabs>
-          <w:tab w:val="num" w:pos="5760"/>
-        </w:tabs>
-        <w:ind w:left="5760" w:hanging="360"/>
-      </w:pPr>
-    </w:lvl>
-    <w:lvl w:ilvl="8" w:tentative="1">
-      <w:start w:val="1"/>
-      <w:numFmt w:val="decimal"/>
-      <w:lvlText w:val="%9."/>
-      <w:lvlJc w:val="left"/>
-      <w:pPr>
-        <w:tabs>
-          <w:tab w:val="num" w:pos="6480"/>
-        </w:tabs>
-        <w:ind w:left="6480" w:hanging="360"/>
-      </w:pPr>
-    </w:lvl>
-  </w:abstractNum>
-  <w:abstractNum w:abstractNumId="26" w15:restartNumberingAfterBreak="0">
-    <w:nsid w:val="5C643F58"/>
-    <w:multiLevelType w:val="multilevel"/>
-    <w:tmpl w:val="B2B6625C"/>
+    <w:tmpl w:val="7F7ADEE8"/>
     <w:lvl w:ilvl="0">
       <w:start w:val="1"/>
       <w:numFmt w:val="bullet"/>
@@ -13641,10 +12850,10 @@
       </w:rPr>
     </w:lvl>
   </w:abstractNum>
-  <w:abstractNum w:abstractNumId="27" w15:restartNumberingAfterBreak="0">
-    <w:nsid w:val="674D3F40"/>
+  <w:abstractNum w:abstractNumId="20" w15:restartNumberingAfterBreak="0">
+    <w:nsid w:val="4D0D3159"/>
     <w:multiLevelType w:val="multilevel"/>
-    <w:tmpl w:val="5EB4AE46"/>
+    <w:tmpl w:val="DAC08434"/>
     <w:lvl w:ilvl="0">
       <w:start w:val="1"/>
       <w:numFmt w:val="bullet"/>
@@ -13790,10 +12999,10 @@
       </w:rPr>
     </w:lvl>
   </w:abstractNum>
-  <w:abstractNum w:abstractNumId="28" w15:restartNumberingAfterBreak="0">
-    <w:nsid w:val="73CC3BF5"/>
+  <w:abstractNum w:abstractNumId="21" w15:restartNumberingAfterBreak="0">
+    <w:nsid w:val="50B6285C"/>
     <w:multiLevelType w:val="multilevel"/>
-    <w:tmpl w:val="B6D6BCC4"/>
+    <w:tmpl w:val="206E7BA2"/>
     <w:lvl w:ilvl="0">
       <w:start w:val="1"/>
       <w:numFmt w:val="decimal"/>
@@ -13903,10 +13112,236 @@
       </w:pPr>
     </w:lvl>
   </w:abstractNum>
-  <w:abstractNum w:abstractNumId="29" w15:restartNumberingAfterBreak="0">
-    <w:nsid w:val="74AC4BD2"/>
+  <w:abstractNum w:abstractNumId="22" w15:restartNumberingAfterBreak="0">
+    <w:nsid w:val="61170411"/>
     <w:multiLevelType w:val="multilevel"/>
-    <w:tmpl w:val="D262994E"/>
+    <w:tmpl w:val="73700E9A"/>
+    <w:lvl w:ilvl="0">
+      <w:start w:val="1"/>
+      <w:numFmt w:val="decimal"/>
+      <w:lvlText w:val="%1."/>
+      <w:lvlJc w:val="left"/>
+      <w:pPr>
+        <w:tabs>
+          <w:tab w:val="num" w:pos="720"/>
+        </w:tabs>
+        <w:ind w:left="720" w:hanging="360"/>
+      </w:pPr>
+    </w:lvl>
+    <w:lvl w:ilvl="1" w:tentative="1">
+      <w:start w:val="1"/>
+      <w:numFmt w:val="decimal"/>
+      <w:lvlText w:val="%2."/>
+      <w:lvlJc w:val="left"/>
+      <w:pPr>
+        <w:tabs>
+          <w:tab w:val="num" w:pos="1440"/>
+        </w:tabs>
+        <w:ind w:left="1440" w:hanging="360"/>
+      </w:pPr>
+    </w:lvl>
+    <w:lvl w:ilvl="2" w:tentative="1">
+      <w:start w:val="1"/>
+      <w:numFmt w:val="decimal"/>
+      <w:lvlText w:val="%3."/>
+      <w:lvlJc w:val="left"/>
+      <w:pPr>
+        <w:tabs>
+          <w:tab w:val="num" w:pos="2160"/>
+        </w:tabs>
+        <w:ind w:left="2160" w:hanging="360"/>
+      </w:pPr>
+    </w:lvl>
+    <w:lvl w:ilvl="3" w:tentative="1">
+      <w:start w:val="1"/>
+      <w:numFmt w:val="decimal"/>
+      <w:lvlText w:val="%4."/>
+      <w:lvlJc w:val="left"/>
+      <w:pPr>
+        <w:tabs>
+          <w:tab w:val="num" w:pos="2880"/>
+        </w:tabs>
+        <w:ind w:left="2880" w:hanging="360"/>
+      </w:pPr>
+    </w:lvl>
+    <w:lvl w:ilvl="4" w:tentative="1">
+      <w:start w:val="1"/>
+      <w:numFmt w:val="decimal"/>
+      <w:lvlText w:val="%5."/>
+      <w:lvlJc w:val="left"/>
+      <w:pPr>
+        <w:tabs>
+          <w:tab w:val="num" w:pos="3600"/>
+        </w:tabs>
+        <w:ind w:left="3600" w:hanging="360"/>
+      </w:pPr>
+    </w:lvl>
+    <w:lvl w:ilvl="5" w:tentative="1">
+      <w:start w:val="1"/>
+      <w:numFmt w:val="decimal"/>
+      <w:lvlText w:val="%6."/>
+      <w:lvlJc w:val="left"/>
+      <w:pPr>
+        <w:tabs>
+          <w:tab w:val="num" w:pos="4320"/>
+        </w:tabs>
+        <w:ind w:left="4320" w:hanging="360"/>
+      </w:pPr>
+    </w:lvl>
+    <w:lvl w:ilvl="6" w:tentative="1">
+      <w:start w:val="1"/>
+      <w:numFmt w:val="decimal"/>
+      <w:lvlText w:val="%7."/>
+      <w:lvlJc w:val="left"/>
+      <w:pPr>
+        <w:tabs>
+          <w:tab w:val="num" w:pos="5040"/>
+        </w:tabs>
+        <w:ind w:left="5040" w:hanging="360"/>
+      </w:pPr>
+    </w:lvl>
+    <w:lvl w:ilvl="7" w:tentative="1">
+      <w:start w:val="1"/>
+      <w:numFmt w:val="decimal"/>
+      <w:lvlText w:val="%8."/>
+      <w:lvlJc w:val="left"/>
+      <w:pPr>
+        <w:tabs>
+          <w:tab w:val="num" w:pos="5760"/>
+        </w:tabs>
+        <w:ind w:left="5760" w:hanging="360"/>
+      </w:pPr>
+    </w:lvl>
+    <w:lvl w:ilvl="8" w:tentative="1">
+      <w:start w:val="1"/>
+      <w:numFmt w:val="decimal"/>
+      <w:lvlText w:val="%9."/>
+      <w:lvlJc w:val="left"/>
+      <w:pPr>
+        <w:tabs>
+          <w:tab w:val="num" w:pos="6480"/>
+        </w:tabs>
+        <w:ind w:left="6480" w:hanging="360"/>
+      </w:pPr>
+    </w:lvl>
+  </w:abstractNum>
+  <w:abstractNum w:abstractNumId="23" w15:restartNumberingAfterBreak="0">
+    <w:nsid w:val="6C1A76CC"/>
+    <w:multiLevelType w:val="multilevel"/>
+    <w:tmpl w:val="83C8F934"/>
+    <w:lvl w:ilvl="0">
+      <w:start w:val="1"/>
+      <w:numFmt w:val="decimal"/>
+      <w:lvlText w:val="%1."/>
+      <w:lvlJc w:val="left"/>
+      <w:pPr>
+        <w:tabs>
+          <w:tab w:val="num" w:pos="720"/>
+        </w:tabs>
+        <w:ind w:left="720" w:hanging="360"/>
+      </w:pPr>
+    </w:lvl>
+    <w:lvl w:ilvl="1" w:tentative="1">
+      <w:start w:val="1"/>
+      <w:numFmt w:val="decimal"/>
+      <w:lvlText w:val="%2."/>
+      <w:lvlJc w:val="left"/>
+      <w:pPr>
+        <w:tabs>
+          <w:tab w:val="num" w:pos="1440"/>
+        </w:tabs>
+        <w:ind w:left="1440" w:hanging="360"/>
+      </w:pPr>
+    </w:lvl>
+    <w:lvl w:ilvl="2" w:tentative="1">
+      <w:start w:val="1"/>
+      <w:numFmt w:val="decimal"/>
+      <w:lvlText w:val="%3."/>
+      <w:lvlJc w:val="left"/>
+      <w:pPr>
+        <w:tabs>
+          <w:tab w:val="num" w:pos="2160"/>
+        </w:tabs>
+        <w:ind w:left="2160" w:hanging="360"/>
+      </w:pPr>
+    </w:lvl>
+    <w:lvl w:ilvl="3" w:tentative="1">
+      <w:start w:val="1"/>
+      <w:numFmt w:val="decimal"/>
+      <w:lvlText w:val="%4."/>
+      <w:lvlJc w:val="left"/>
+      <w:pPr>
+        <w:tabs>
+          <w:tab w:val="num" w:pos="2880"/>
+        </w:tabs>
+        <w:ind w:left="2880" w:hanging="360"/>
+      </w:pPr>
+    </w:lvl>
+    <w:lvl w:ilvl="4" w:tentative="1">
+      <w:start w:val="1"/>
+      <w:numFmt w:val="decimal"/>
+      <w:lvlText w:val="%5."/>
+      <w:lvlJc w:val="left"/>
+      <w:pPr>
+        <w:tabs>
+          <w:tab w:val="num" w:pos="3600"/>
+        </w:tabs>
+        <w:ind w:left="3600" w:hanging="360"/>
+      </w:pPr>
+    </w:lvl>
+    <w:lvl w:ilvl="5" w:tentative="1">
+      <w:start w:val="1"/>
+      <w:numFmt w:val="decimal"/>
+      <w:lvlText w:val="%6."/>
+      <w:lvlJc w:val="left"/>
+      <w:pPr>
+        <w:tabs>
+          <w:tab w:val="num" w:pos="4320"/>
+        </w:tabs>
+        <w:ind w:left="4320" w:hanging="360"/>
+      </w:pPr>
+    </w:lvl>
+    <w:lvl w:ilvl="6" w:tentative="1">
+      <w:start w:val="1"/>
+      <w:numFmt w:val="decimal"/>
+      <w:lvlText w:val="%7."/>
+      <w:lvlJc w:val="left"/>
+      <w:pPr>
+        <w:tabs>
+          <w:tab w:val="num" w:pos="5040"/>
+        </w:tabs>
+        <w:ind w:left="5040" w:hanging="360"/>
+      </w:pPr>
+    </w:lvl>
+    <w:lvl w:ilvl="7" w:tentative="1">
+      <w:start w:val="1"/>
+      <w:numFmt w:val="decimal"/>
+      <w:lvlText w:val="%8."/>
+      <w:lvlJc w:val="left"/>
+      <w:pPr>
+        <w:tabs>
+          <w:tab w:val="num" w:pos="5760"/>
+        </w:tabs>
+        <w:ind w:left="5760" w:hanging="360"/>
+      </w:pPr>
+    </w:lvl>
+    <w:lvl w:ilvl="8" w:tentative="1">
+      <w:start w:val="1"/>
+      <w:numFmt w:val="decimal"/>
+      <w:lvlText w:val="%9."/>
+      <w:lvlJc w:val="left"/>
+      <w:pPr>
+        <w:tabs>
+          <w:tab w:val="num" w:pos="6480"/>
+        </w:tabs>
+        <w:ind w:left="6480" w:hanging="360"/>
+      </w:pPr>
+    </w:lvl>
+  </w:abstractNum>
+  <w:abstractNum w:abstractNumId="24" w15:restartNumberingAfterBreak="0">
+    <w:nsid w:val="6C8E4BF9"/>
+    <w:multiLevelType w:val="multilevel"/>
+    <w:tmpl w:val="97367CE0"/>
     <w:lvl w:ilvl="0">
       <w:start w:val="1"/>
       <w:numFmt w:val="bullet"/>
@@ -14052,95 +13487,660 @@
       </w:rPr>
     </w:lvl>
   </w:abstractNum>
-  <w:num w:numId="1" w16cid:durableId="1277181028">
+  <w:abstractNum w:abstractNumId="25" w15:restartNumberingAfterBreak="0">
+    <w:nsid w:val="700419A2"/>
+    <w:multiLevelType w:val="multilevel"/>
+    <w:tmpl w:val="1868C858"/>
+    <w:lvl w:ilvl="0">
+      <w:start w:val="1"/>
+      <w:numFmt w:val="decimal"/>
+      <w:lvlText w:val="%1."/>
+      <w:lvlJc w:val="left"/>
+      <w:pPr>
+        <w:tabs>
+          <w:tab w:val="num" w:pos="720"/>
+        </w:tabs>
+        <w:ind w:left="720" w:hanging="360"/>
+      </w:pPr>
+    </w:lvl>
+    <w:lvl w:ilvl="1" w:tentative="1">
+      <w:start w:val="1"/>
+      <w:numFmt w:val="decimal"/>
+      <w:lvlText w:val="%2."/>
+      <w:lvlJc w:val="left"/>
+      <w:pPr>
+        <w:tabs>
+          <w:tab w:val="num" w:pos="1440"/>
+        </w:tabs>
+        <w:ind w:left="1440" w:hanging="360"/>
+      </w:pPr>
+    </w:lvl>
+    <w:lvl w:ilvl="2" w:tentative="1">
+      <w:start w:val="1"/>
+      <w:numFmt w:val="decimal"/>
+      <w:lvlText w:val="%3."/>
+      <w:lvlJc w:val="left"/>
+      <w:pPr>
+        <w:tabs>
+          <w:tab w:val="num" w:pos="2160"/>
+        </w:tabs>
+        <w:ind w:left="2160" w:hanging="360"/>
+      </w:pPr>
+    </w:lvl>
+    <w:lvl w:ilvl="3" w:tentative="1">
+      <w:start w:val="1"/>
+      <w:numFmt w:val="decimal"/>
+      <w:lvlText w:val="%4."/>
+      <w:lvlJc w:val="left"/>
+      <w:pPr>
+        <w:tabs>
+          <w:tab w:val="num" w:pos="2880"/>
+        </w:tabs>
+        <w:ind w:left="2880" w:hanging="360"/>
+      </w:pPr>
+    </w:lvl>
+    <w:lvl w:ilvl="4" w:tentative="1">
+      <w:start w:val="1"/>
+      <w:numFmt w:val="decimal"/>
+      <w:lvlText w:val="%5."/>
+      <w:lvlJc w:val="left"/>
+      <w:pPr>
+        <w:tabs>
+          <w:tab w:val="num" w:pos="3600"/>
+        </w:tabs>
+        <w:ind w:left="3600" w:hanging="360"/>
+      </w:pPr>
+    </w:lvl>
+    <w:lvl w:ilvl="5" w:tentative="1">
+      <w:start w:val="1"/>
+      <w:numFmt w:val="decimal"/>
+      <w:lvlText w:val="%6."/>
+      <w:lvlJc w:val="left"/>
+      <w:pPr>
+        <w:tabs>
+          <w:tab w:val="num" w:pos="4320"/>
+        </w:tabs>
+        <w:ind w:left="4320" w:hanging="360"/>
+      </w:pPr>
+    </w:lvl>
+    <w:lvl w:ilvl="6" w:tentative="1">
+      <w:start w:val="1"/>
+      <w:numFmt w:val="decimal"/>
+      <w:lvlText w:val="%7."/>
+      <w:lvlJc w:val="left"/>
+      <w:pPr>
+        <w:tabs>
+          <w:tab w:val="num" w:pos="5040"/>
+        </w:tabs>
+        <w:ind w:left="5040" w:hanging="360"/>
+      </w:pPr>
+    </w:lvl>
+    <w:lvl w:ilvl="7" w:tentative="1">
+      <w:start w:val="1"/>
+      <w:numFmt w:val="decimal"/>
+      <w:lvlText w:val="%8."/>
+      <w:lvlJc w:val="left"/>
+      <w:pPr>
+        <w:tabs>
+          <w:tab w:val="num" w:pos="5760"/>
+        </w:tabs>
+        <w:ind w:left="5760" w:hanging="360"/>
+      </w:pPr>
+    </w:lvl>
+    <w:lvl w:ilvl="8" w:tentative="1">
+      <w:start w:val="1"/>
+      <w:numFmt w:val="decimal"/>
+      <w:lvlText w:val="%9."/>
+      <w:lvlJc w:val="left"/>
+      <w:pPr>
+        <w:tabs>
+          <w:tab w:val="num" w:pos="6480"/>
+        </w:tabs>
+        <w:ind w:left="6480" w:hanging="360"/>
+      </w:pPr>
+    </w:lvl>
+  </w:abstractNum>
+  <w:abstractNum w:abstractNumId="26" w15:restartNumberingAfterBreak="0">
+    <w:nsid w:val="71627B35"/>
+    <w:multiLevelType w:val="multilevel"/>
+    <w:tmpl w:val="FFF4CAB6"/>
+    <w:lvl w:ilvl="0">
+      <w:start w:val="1"/>
+      <w:numFmt w:val="decimal"/>
+      <w:lvlText w:val="%1."/>
+      <w:lvlJc w:val="left"/>
+      <w:pPr>
+        <w:tabs>
+          <w:tab w:val="num" w:pos="720"/>
+        </w:tabs>
+        <w:ind w:left="720" w:hanging="360"/>
+      </w:pPr>
+    </w:lvl>
+    <w:lvl w:ilvl="1" w:tentative="1">
+      <w:start w:val="1"/>
+      <w:numFmt w:val="decimal"/>
+      <w:lvlText w:val="%2."/>
+      <w:lvlJc w:val="left"/>
+      <w:pPr>
+        <w:tabs>
+          <w:tab w:val="num" w:pos="1440"/>
+        </w:tabs>
+        <w:ind w:left="1440" w:hanging="360"/>
+      </w:pPr>
+    </w:lvl>
+    <w:lvl w:ilvl="2" w:tentative="1">
+      <w:start w:val="1"/>
+      <w:numFmt w:val="decimal"/>
+      <w:lvlText w:val="%3."/>
+      <w:lvlJc w:val="left"/>
+      <w:pPr>
+        <w:tabs>
+          <w:tab w:val="num" w:pos="2160"/>
+        </w:tabs>
+        <w:ind w:left="2160" w:hanging="360"/>
+      </w:pPr>
+    </w:lvl>
+    <w:lvl w:ilvl="3" w:tentative="1">
+      <w:start w:val="1"/>
+      <w:numFmt w:val="decimal"/>
+      <w:lvlText w:val="%4."/>
+      <w:lvlJc w:val="left"/>
+      <w:pPr>
+        <w:tabs>
+          <w:tab w:val="num" w:pos="2880"/>
+        </w:tabs>
+        <w:ind w:left="2880" w:hanging="360"/>
+      </w:pPr>
+    </w:lvl>
+    <w:lvl w:ilvl="4" w:tentative="1">
+      <w:start w:val="1"/>
+      <w:numFmt w:val="decimal"/>
+      <w:lvlText w:val="%5."/>
+      <w:lvlJc w:val="left"/>
+      <w:pPr>
+        <w:tabs>
+          <w:tab w:val="num" w:pos="3600"/>
+        </w:tabs>
+        <w:ind w:left="3600" w:hanging="360"/>
+      </w:pPr>
+    </w:lvl>
+    <w:lvl w:ilvl="5" w:tentative="1">
+      <w:start w:val="1"/>
+      <w:numFmt w:val="decimal"/>
+      <w:lvlText w:val="%6."/>
+      <w:lvlJc w:val="left"/>
+      <w:pPr>
+        <w:tabs>
+          <w:tab w:val="num" w:pos="4320"/>
+        </w:tabs>
+        <w:ind w:left="4320" w:hanging="360"/>
+      </w:pPr>
+    </w:lvl>
+    <w:lvl w:ilvl="6" w:tentative="1">
+      <w:start w:val="1"/>
+      <w:numFmt w:val="decimal"/>
+      <w:lvlText w:val="%7."/>
+      <w:lvlJc w:val="left"/>
+      <w:pPr>
+        <w:tabs>
+          <w:tab w:val="num" w:pos="5040"/>
+        </w:tabs>
+        <w:ind w:left="5040" w:hanging="360"/>
+      </w:pPr>
+    </w:lvl>
+    <w:lvl w:ilvl="7" w:tentative="1">
+      <w:start w:val="1"/>
+      <w:numFmt w:val="decimal"/>
+      <w:lvlText w:val="%8."/>
+      <w:lvlJc w:val="left"/>
+      <w:pPr>
+        <w:tabs>
+          <w:tab w:val="num" w:pos="5760"/>
+        </w:tabs>
+        <w:ind w:left="5760" w:hanging="360"/>
+      </w:pPr>
+    </w:lvl>
+    <w:lvl w:ilvl="8" w:tentative="1">
+      <w:start w:val="1"/>
+      <w:numFmt w:val="decimal"/>
+      <w:lvlText w:val="%9."/>
+      <w:lvlJc w:val="left"/>
+      <w:pPr>
+        <w:tabs>
+          <w:tab w:val="num" w:pos="6480"/>
+        </w:tabs>
+        <w:ind w:left="6480" w:hanging="360"/>
+      </w:pPr>
+    </w:lvl>
+  </w:abstractNum>
+  <w:abstractNum w:abstractNumId="27" w15:restartNumberingAfterBreak="0">
+    <w:nsid w:val="7954507D"/>
+    <w:multiLevelType w:val="multilevel"/>
+    <w:tmpl w:val="2CF631A8"/>
+    <w:lvl w:ilvl="0">
+      <w:start w:val="1"/>
+      <w:numFmt w:val="decimal"/>
+      <w:lvlText w:val="%1."/>
+      <w:lvlJc w:val="left"/>
+      <w:pPr>
+        <w:tabs>
+          <w:tab w:val="num" w:pos="720"/>
+        </w:tabs>
+        <w:ind w:left="720" w:hanging="360"/>
+      </w:pPr>
+    </w:lvl>
+    <w:lvl w:ilvl="1" w:tentative="1">
+      <w:start w:val="1"/>
+      <w:numFmt w:val="decimal"/>
+      <w:lvlText w:val="%2."/>
+      <w:lvlJc w:val="left"/>
+      <w:pPr>
+        <w:tabs>
+          <w:tab w:val="num" w:pos="1440"/>
+        </w:tabs>
+        <w:ind w:left="1440" w:hanging="360"/>
+      </w:pPr>
+    </w:lvl>
+    <w:lvl w:ilvl="2" w:tentative="1">
+      <w:start w:val="1"/>
+      <w:numFmt w:val="decimal"/>
+      <w:lvlText w:val="%3."/>
+      <w:lvlJc w:val="left"/>
+      <w:pPr>
+        <w:tabs>
+          <w:tab w:val="num" w:pos="2160"/>
+        </w:tabs>
+        <w:ind w:left="2160" w:hanging="360"/>
+      </w:pPr>
+    </w:lvl>
+    <w:lvl w:ilvl="3" w:tentative="1">
+      <w:start w:val="1"/>
+      <w:numFmt w:val="decimal"/>
+      <w:lvlText w:val="%4."/>
+      <w:lvlJc w:val="left"/>
+      <w:pPr>
+        <w:tabs>
+          <w:tab w:val="num" w:pos="2880"/>
+        </w:tabs>
+        <w:ind w:left="2880" w:hanging="360"/>
+      </w:pPr>
+    </w:lvl>
+    <w:lvl w:ilvl="4" w:tentative="1">
+      <w:start w:val="1"/>
+      <w:numFmt w:val="decimal"/>
+      <w:lvlText w:val="%5."/>
+      <w:lvlJc w:val="left"/>
+      <w:pPr>
+        <w:tabs>
+          <w:tab w:val="num" w:pos="3600"/>
+        </w:tabs>
+        <w:ind w:left="3600" w:hanging="360"/>
+      </w:pPr>
+    </w:lvl>
+    <w:lvl w:ilvl="5" w:tentative="1">
+      <w:start w:val="1"/>
+      <w:numFmt w:val="decimal"/>
+      <w:lvlText w:val="%6."/>
+      <w:lvlJc w:val="left"/>
+      <w:pPr>
+        <w:tabs>
+          <w:tab w:val="num" w:pos="4320"/>
+        </w:tabs>
+        <w:ind w:left="4320" w:hanging="360"/>
+      </w:pPr>
+    </w:lvl>
+    <w:lvl w:ilvl="6" w:tentative="1">
+      <w:start w:val="1"/>
+      <w:numFmt w:val="decimal"/>
+      <w:lvlText w:val="%7."/>
+      <w:lvlJc w:val="left"/>
+      <w:pPr>
+        <w:tabs>
+          <w:tab w:val="num" w:pos="5040"/>
+        </w:tabs>
+        <w:ind w:left="5040" w:hanging="360"/>
+      </w:pPr>
+    </w:lvl>
+    <w:lvl w:ilvl="7" w:tentative="1">
+      <w:start w:val="1"/>
+      <w:numFmt w:val="decimal"/>
+      <w:lvlText w:val="%8."/>
+      <w:lvlJc w:val="left"/>
+      <w:pPr>
+        <w:tabs>
+          <w:tab w:val="num" w:pos="5760"/>
+        </w:tabs>
+        <w:ind w:left="5760" w:hanging="360"/>
+      </w:pPr>
+    </w:lvl>
+    <w:lvl w:ilvl="8" w:tentative="1">
+      <w:start w:val="1"/>
+      <w:numFmt w:val="decimal"/>
+      <w:lvlText w:val="%9."/>
+      <w:lvlJc w:val="left"/>
+      <w:pPr>
+        <w:tabs>
+          <w:tab w:val="num" w:pos="6480"/>
+        </w:tabs>
+        <w:ind w:left="6480" w:hanging="360"/>
+      </w:pPr>
+    </w:lvl>
+  </w:abstractNum>
+  <w:abstractNum w:abstractNumId="28" w15:restartNumberingAfterBreak="0">
+    <w:nsid w:val="7D1305C1"/>
+    <w:multiLevelType w:val="multilevel"/>
+    <w:tmpl w:val="EAAEDD6C"/>
+    <w:lvl w:ilvl="0">
+      <w:start w:val="1"/>
+      <w:numFmt w:val="decimal"/>
+      <w:lvlText w:val="%1."/>
+      <w:lvlJc w:val="left"/>
+      <w:pPr>
+        <w:tabs>
+          <w:tab w:val="num" w:pos="720"/>
+        </w:tabs>
+        <w:ind w:left="720" w:hanging="360"/>
+      </w:pPr>
+    </w:lvl>
+    <w:lvl w:ilvl="1" w:tentative="1">
+      <w:start w:val="1"/>
+      <w:numFmt w:val="decimal"/>
+      <w:lvlText w:val="%2."/>
+      <w:lvlJc w:val="left"/>
+      <w:pPr>
+        <w:tabs>
+          <w:tab w:val="num" w:pos="1440"/>
+        </w:tabs>
+        <w:ind w:left="1440" w:hanging="360"/>
+      </w:pPr>
+    </w:lvl>
+    <w:lvl w:ilvl="2" w:tentative="1">
+      <w:start w:val="1"/>
+      <w:numFmt w:val="decimal"/>
+      <w:lvlText w:val="%3."/>
+      <w:lvlJc w:val="left"/>
+      <w:pPr>
+        <w:tabs>
+          <w:tab w:val="num" w:pos="2160"/>
+        </w:tabs>
+        <w:ind w:left="2160" w:hanging="360"/>
+      </w:pPr>
+    </w:lvl>
+    <w:lvl w:ilvl="3" w:tentative="1">
+      <w:start w:val="1"/>
+      <w:numFmt w:val="decimal"/>
+      <w:lvlText w:val="%4."/>
+      <w:lvlJc w:val="left"/>
+      <w:pPr>
+        <w:tabs>
+          <w:tab w:val="num" w:pos="2880"/>
+        </w:tabs>
+        <w:ind w:left="2880" w:hanging="360"/>
+      </w:pPr>
+    </w:lvl>
+    <w:lvl w:ilvl="4" w:tentative="1">
+      <w:start w:val="1"/>
+      <w:numFmt w:val="decimal"/>
+      <w:lvlText w:val="%5."/>
+      <w:lvlJc w:val="left"/>
+      <w:pPr>
+        <w:tabs>
+          <w:tab w:val="num" w:pos="3600"/>
+        </w:tabs>
+        <w:ind w:left="3600" w:hanging="360"/>
+      </w:pPr>
+    </w:lvl>
+    <w:lvl w:ilvl="5" w:tentative="1">
+      <w:start w:val="1"/>
+      <w:numFmt w:val="decimal"/>
+      <w:lvlText w:val="%6."/>
+      <w:lvlJc w:val="left"/>
+      <w:pPr>
+        <w:tabs>
+          <w:tab w:val="num" w:pos="4320"/>
+        </w:tabs>
+        <w:ind w:left="4320" w:hanging="360"/>
+      </w:pPr>
+    </w:lvl>
+    <w:lvl w:ilvl="6" w:tentative="1">
+      <w:start w:val="1"/>
+      <w:numFmt w:val="decimal"/>
+      <w:lvlText w:val="%7."/>
+      <w:lvlJc w:val="left"/>
+      <w:pPr>
+        <w:tabs>
+          <w:tab w:val="num" w:pos="5040"/>
+        </w:tabs>
+        <w:ind w:left="5040" w:hanging="360"/>
+      </w:pPr>
+    </w:lvl>
+    <w:lvl w:ilvl="7" w:tentative="1">
+      <w:start w:val="1"/>
+      <w:numFmt w:val="decimal"/>
+      <w:lvlText w:val="%8."/>
+      <w:lvlJc w:val="left"/>
+      <w:pPr>
+        <w:tabs>
+          <w:tab w:val="num" w:pos="5760"/>
+        </w:tabs>
+        <w:ind w:left="5760" w:hanging="360"/>
+      </w:pPr>
+    </w:lvl>
+    <w:lvl w:ilvl="8" w:tentative="1">
+      <w:start w:val="1"/>
+      <w:numFmt w:val="decimal"/>
+      <w:lvlText w:val="%9."/>
+      <w:lvlJc w:val="left"/>
+      <w:pPr>
+        <w:tabs>
+          <w:tab w:val="num" w:pos="6480"/>
+        </w:tabs>
+        <w:ind w:left="6480" w:hanging="360"/>
+      </w:pPr>
+    </w:lvl>
+  </w:abstractNum>
+  <w:abstractNum w:abstractNumId="29" w15:restartNumberingAfterBreak="0">
+    <w:nsid w:val="7E9A354D"/>
+    <w:multiLevelType w:val="multilevel"/>
+    <w:tmpl w:val="18585C5A"/>
+    <w:lvl w:ilvl="0">
+      <w:start w:val="1"/>
+      <w:numFmt w:val="decimal"/>
+      <w:lvlText w:val="%1."/>
+      <w:lvlJc w:val="left"/>
+      <w:pPr>
+        <w:tabs>
+          <w:tab w:val="num" w:pos="720"/>
+        </w:tabs>
+        <w:ind w:left="720" w:hanging="360"/>
+      </w:pPr>
+    </w:lvl>
+    <w:lvl w:ilvl="1" w:tentative="1">
+      <w:start w:val="1"/>
+      <w:numFmt w:val="decimal"/>
+      <w:lvlText w:val="%2."/>
+      <w:lvlJc w:val="left"/>
+      <w:pPr>
+        <w:tabs>
+          <w:tab w:val="num" w:pos="1440"/>
+        </w:tabs>
+        <w:ind w:left="1440" w:hanging="360"/>
+      </w:pPr>
+    </w:lvl>
+    <w:lvl w:ilvl="2" w:tentative="1">
+      <w:start w:val="1"/>
+      <w:numFmt w:val="decimal"/>
+      <w:lvlText w:val="%3."/>
+      <w:lvlJc w:val="left"/>
+      <w:pPr>
+        <w:tabs>
+          <w:tab w:val="num" w:pos="2160"/>
+        </w:tabs>
+        <w:ind w:left="2160" w:hanging="360"/>
+      </w:pPr>
+    </w:lvl>
+    <w:lvl w:ilvl="3" w:tentative="1">
+      <w:start w:val="1"/>
+      <w:numFmt w:val="decimal"/>
+      <w:lvlText w:val="%4."/>
+      <w:lvlJc w:val="left"/>
+      <w:pPr>
+        <w:tabs>
+          <w:tab w:val="num" w:pos="2880"/>
+        </w:tabs>
+        <w:ind w:left="2880" w:hanging="360"/>
+      </w:pPr>
+    </w:lvl>
+    <w:lvl w:ilvl="4" w:tentative="1">
+      <w:start w:val="1"/>
+      <w:numFmt w:val="decimal"/>
+      <w:lvlText w:val="%5."/>
+      <w:lvlJc w:val="left"/>
+      <w:pPr>
+        <w:tabs>
+          <w:tab w:val="num" w:pos="3600"/>
+        </w:tabs>
+        <w:ind w:left="3600" w:hanging="360"/>
+      </w:pPr>
+    </w:lvl>
+    <w:lvl w:ilvl="5" w:tentative="1">
+      <w:start w:val="1"/>
+      <w:numFmt w:val="decimal"/>
+      <w:lvlText w:val="%6."/>
+      <w:lvlJc w:val="left"/>
+      <w:pPr>
+        <w:tabs>
+          <w:tab w:val="num" w:pos="4320"/>
+        </w:tabs>
+        <w:ind w:left="4320" w:hanging="360"/>
+      </w:pPr>
+    </w:lvl>
+    <w:lvl w:ilvl="6" w:tentative="1">
+      <w:start w:val="1"/>
+      <w:numFmt w:val="decimal"/>
+      <w:lvlText w:val="%7."/>
+      <w:lvlJc w:val="left"/>
+      <w:pPr>
+        <w:tabs>
+          <w:tab w:val="num" w:pos="5040"/>
+        </w:tabs>
+        <w:ind w:left="5040" w:hanging="360"/>
+      </w:pPr>
+    </w:lvl>
+    <w:lvl w:ilvl="7" w:tentative="1">
+      <w:start w:val="1"/>
+      <w:numFmt w:val="decimal"/>
+      <w:lvlText w:val="%8."/>
+      <w:lvlJc w:val="left"/>
+      <w:pPr>
+        <w:tabs>
+          <w:tab w:val="num" w:pos="5760"/>
+        </w:tabs>
+        <w:ind w:left="5760" w:hanging="360"/>
+      </w:pPr>
+    </w:lvl>
+    <w:lvl w:ilvl="8" w:tentative="1">
+      <w:start w:val="1"/>
+      <w:numFmt w:val="decimal"/>
+      <w:lvlText w:val="%9."/>
+      <w:lvlJc w:val="left"/>
+      <w:pPr>
+        <w:tabs>
+          <w:tab w:val="num" w:pos="6480"/>
+        </w:tabs>
+        <w:ind w:left="6480" w:hanging="360"/>
+      </w:pPr>
+    </w:lvl>
+  </w:abstractNum>
+  <w:num w:numId="1" w16cid:durableId="2013296061">
+    <w:abstractNumId w:val="19"/>
+  </w:num>
+  <w:num w:numId="2" w16cid:durableId="1162501702">
     <w:abstractNumId w:val="4"/>
   </w:num>
-  <w:num w:numId="2" w16cid:durableId="1463156736">
+  <w:num w:numId="3" w16cid:durableId="436411811">
+    <w:abstractNumId w:val="20"/>
+  </w:num>
+  <w:num w:numId="4" w16cid:durableId="1648123419">
+    <w:abstractNumId w:val="5"/>
+  </w:num>
+  <w:num w:numId="5" w16cid:durableId="2109543086">
+    <w:abstractNumId w:val="1"/>
+  </w:num>
+  <w:num w:numId="6" w16cid:durableId="188220033">
+    <w:abstractNumId w:val="15"/>
+  </w:num>
+  <w:num w:numId="7" w16cid:durableId="62530383">
+    <w:abstractNumId w:val="9"/>
+  </w:num>
+  <w:num w:numId="8" w16cid:durableId="2094275481">
+    <w:abstractNumId w:val="18"/>
+  </w:num>
+  <w:num w:numId="9" w16cid:durableId="965239551">
+    <w:abstractNumId w:val="0"/>
+  </w:num>
+  <w:num w:numId="10" w16cid:durableId="630480363">
+    <w:abstractNumId w:val="2"/>
+  </w:num>
+  <w:num w:numId="11" w16cid:durableId="898369425">
+    <w:abstractNumId w:val="14"/>
+  </w:num>
+  <w:num w:numId="12" w16cid:durableId="1057625456">
+    <w:abstractNumId w:val="21"/>
+  </w:num>
+  <w:num w:numId="13" w16cid:durableId="1913151882">
+    <w:abstractNumId w:val="10"/>
+  </w:num>
+  <w:num w:numId="14" w16cid:durableId="340360114">
+    <w:abstractNumId w:val="13"/>
+  </w:num>
+  <w:num w:numId="15" w16cid:durableId="2091466419">
+    <w:abstractNumId w:val="11"/>
+  </w:num>
+  <w:num w:numId="16" w16cid:durableId="1564439771">
+    <w:abstractNumId w:val="3"/>
+  </w:num>
+  <w:num w:numId="17" w16cid:durableId="771097136">
+    <w:abstractNumId w:val="12"/>
+  </w:num>
+  <w:num w:numId="18" w16cid:durableId="354574238">
+    <w:abstractNumId w:val="6"/>
+  </w:num>
+  <w:num w:numId="19" w16cid:durableId="903299975">
+    <w:abstractNumId w:val="25"/>
+  </w:num>
+  <w:num w:numId="20" w16cid:durableId="873542328">
+    <w:abstractNumId w:val="22"/>
+  </w:num>
+  <w:num w:numId="21" w16cid:durableId="436757947">
+    <w:abstractNumId w:val="7"/>
+  </w:num>
+  <w:num w:numId="22" w16cid:durableId="843546617">
+    <w:abstractNumId w:val="27"/>
+  </w:num>
+  <w:num w:numId="23" w16cid:durableId="1743454499">
+    <w:abstractNumId w:val="8"/>
+  </w:num>
+  <w:num w:numId="24" w16cid:durableId="329337893">
+    <w:abstractNumId w:val="17"/>
+  </w:num>
+  <w:num w:numId="25" w16cid:durableId="800415042">
+    <w:abstractNumId w:val="26"/>
+  </w:num>
+  <w:num w:numId="26" w16cid:durableId="194661697">
+    <w:abstractNumId w:val="28"/>
+  </w:num>
+  <w:num w:numId="27" w16cid:durableId="832065156">
     <w:abstractNumId w:val="29"/>
   </w:num>
-  <w:num w:numId="3" w16cid:durableId="1975021428">
-    <w:abstractNumId w:val="26"/>
-  </w:num>
-  <w:num w:numId="4" w16cid:durableId="1344436035">
-    <w:abstractNumId w:val="1"/>
-  </w:num>
-  <w:num w:numId="5" w16cid:durableId="851384256">
-    <w:abstractNumId w:val="5"/>
-  </w:num>
-  <w:num w:numId="6" w16cid:durableId="826937188">
-    <w:abstractNumId w:val="27"/>
-  </w:num>
-  <w:num w:numId="7" w16cid:durableId="415438219">
-    <w:abstractNumId w:val="12"/>
-  </w:num>
-  <w:num w:numId="8" w16cid:durableId="1750276016">
-    <w:abstractNumId w:val="9"/>
-  </w:num>
-  <w:num w:numId="9" w16cid:durableId="331446058">
-    <w:abstractNumId w:val="28"/>
-  </w:num>
-  <w:num w:numId="10" w16cid:durableId="66729345">
-    <w:abstractNumId w:val="22"/>
-  </w:num>
-  <w:num w:numId="11" w16cid:durableId="364713955">
-    <w:abstractNumId w:val="21"/>
-  </w:num>
-  <w:num w:numId="12" w16cid:durableId="1720788858">
-    <w:abstractNumId w:val="16"/>
-  </w:num>
-  <w:num w:numId="13" w16cid:durableId="1387486014">
-    <w:abstractNumId w:val="19"/>
-  </w:num>
-  <w:num w:numId="14" w16cid:durableId="1489980950">
-    <w:abstractNumId w:val="17"/>
-  </w:num>
-  <w:num w:numId="15" w16cid:durableId="36390816">
-    <w:abstractNumId w:val="25"/>
-  </w:num>
-  <w:num w:numId="16" w16cid:durableId="2098474762">
-    <w:abstractNumId w:val="2"/>
-  </w:num>
-  <w:num w:numId="17" w16cid:durableId="2054575975">
+  <w:num w:numId="28" w16cid:durableId="502623478">
     <w:abstractNumId w:val="24"/>
   </w:num>
-  <w:num w:numId="18" w16cid:durableId="1768035373">
-    <w:abstractNumId w:val="20"/>
-  </w:num>
-  <w:num w:numId="19" w16cid:durableId="1510868011">
-    <w:abstractNumId w:val="18"/>
-  </w:num>
-  <w:num w:numId="20" w16cid:durableId="17506950">
-    <w:abstractNumId w:val="7"/>
-  </w:num>
-  <w:num w:numId="21" w16cid:durableId="392310624">
-    <w:abstractNumId w:val="3"/>
-  </w:num>
-  <w:num w:numId="22" w16cid:durableId="641932582">
-    <w:abstractNumId w:val="14"/>
-  </w:num>
-  <w:num w:numId="23" w16cid:durableId="965820464">
-    <w:abstractNumId w:val="15"/>
-  </w:num>
-  <w:num w:numId="24" w16cid:durableId="1206913458">
-    <w:abstractNumId w:val="13"/>
-  </w:num>
-  <w:num w:numId="25" w16cid:durableId="1854802217">
-    <w:abstractNumId w:val="8"/>
-  </w:num>
-  <w:num w:numId="26" w16cid:durableId="1395660855">
-    <w:abstractNumId w:val="11"/>
-  </w:num>
-  <w:num w:numId="27" w16cid:durableId="1534612353">
-    <w:abstractNumId w:val="10"/>
-  </w:num>
-  <w:num w:numId="28" w16cid:durableId="1308626421">
+  <w:num w:numId="29" w16cid:durableId="1656104744">
     <w:abstractNumId w:val="23"/>
   </w:num>
-  <w:num w:numId="29" w16cid:durableId="103699932">
-    <w:abstractNumId w:val="6"/>
-  </w:num>
-  <w:num w:numId="30" w16cid:durableId="1594775308">
-    <w:abstractNumId w:val="0"/>
+  <w:num w:numId="30" w16cid:durableId="179466364">
+    <w:abstractNumId w:val="16"/>
   </w:num>
 </w:numbering>
 </file>

</xml_diff>

<commit_message>
Manual de usuario: leyenda de la captura del administrador debajo de la imagen
Co-Authored-By: Claude Sonnet 5.5 <noreply@anthropic.com>
</commit_message>
<xml_diff>
--- a/Documentacion/Manuales/Manual-de-usuario.docx
+++ b/Documentacion/Manuales/Manual-de-usuario.docx
@@ -1886,6 +1886,15 @@
           <w:sz w:val="22"/>
           <w:szCs w:val="22"/>
         </w:rPr>
+        <w:br/>
+      </w:r>
+      <w:r>
+        <w:rPr>
+          <w:rFonts w:ascii="Calibri" w:eastAsia="Times New Roman" w:hAnsi="Calibri" w:cs="Calibri"/>
+          <w:color w:val="1C2430"/>
+          <w:sz w:val="22"/>
+          <w:szCs w:val="22"/>
+        </w:rPr>
         <w:t xml:space="preserve">Pantalla para crear el administrador inicial </w:t>
       </w:r>
     </w:p>
@@ -2067,6 +2076,7 @@
         <w:rPr>
           <w:rFonts w:ascii="Calibri" w:eastAsia="Times New Roman" w:hAnsi="Calibri" w:cs="Calibri"/>
         </w:rPr>
+        <w:lastRenderedPageBreak/>
         <w:t>2.2. Pantalla principal</w:t>
       </w:r>
     </w:p>
@@ -2192,7 +2202,7 @@
           <w:szCs w:val="22"/>
         </w:rPr>
         <w:drawing>
-          <wp:inline distT="0" distB="0" distL="0" distR="0" wp14:anchorId="14FAB987" wp14:editId="527FD1EE">
+          <wp:inline distT="0" distB="0" distL="0" distR="0" wp14:anchorId="14FAB987" wp14:editId="48C36A79">
             <wp:extent cx="5400040" cy="3096023"/>
             <wp:effectExtent l="0" t="0" r="0" b="9525"/>
             <wp:docPr id="2" name="Picture 2"/>
@@ -2483,6 +2493,7 @@
         <w:rPr>
           <w:rFonts w:ascii="Calibri" w:eastAsia="Times New Roman" w:hAnsi="Calibri" w:cs="Calibri"/>
         </w:rPr>
+        <w:lastRenderedPageBreak/>
         <w:t>2.3.1. Clientes (CU01)</w:t>
       </w:r>
     </w:p>
@@ -2504,7 +2515,7 @@
           <w:szCs w:val="22"/>
         </w:rPr>
         <w:drawing>
-          <wp:inline distT="0" distB="0" distL="0" distR="0" wp14:anchorId="72714748" wp14:editId="4C898352">
+          <wp:inline distT="0" distB="0" distL="0" distR="0" wp14:anchorId="72714748" wp14:editId="4391BB18">
             <wp:extent cx="5400040" cy="3096023"/>
             <wp:effectExtent l="0" t="0" r="0" b="9525"/>
             <wp:docPr id="3" name="Picture 3"/>
@@ -2806,7 +2817,7 @@
           <w:szCs w:val="22"/>
         </w:rPr>
         <w:drawing>
-          <wp:inline distT="0" distB="0" distL="0" distR="0" wp14:anchorId="6D595BB9" wp14:editId="0187A9CB">
+          <wp:inline distT="0" distB="0" distL="0" distR="0" wp14:anchorId="6D595BB9" wp14:editId="5C1C450C">
             <wp:extent cx="5400040" cy="3096023"/>
             <wp:effectExtent l="0" t="0" r="0" b="9525"/>
             <wp:docPr id="4" name="Picture 4"/>
@@ -3219,7 +3230,7 @@
           <w:szCs w:val="22"/>
         </w:rPr>
         <w:drawing>
-          <wp:inline distT="0" distB="0" distL="0" distR="0" wp14:anchorId="200EEC8F" wp14:editId="7985151B">
+          <wp:inline distT="0" distB="0" distL="0" distR="0" wp14:anchorId="200EEC8F" wp14:editId="7619F015">
             <wp:extent cx="5400040" cy="3080385"/>
             <wp:effectExtent l="0" t="0" r="0" b="5715"/>
             <wp:docPr id="803865746" name="Picture 1"/>
@@ -3655,7 +3666,7 @@
           <w:szCs w:val="22"/>
         </w:rPr>
         <w:drawing>
-          <wp:inline distT="0" distB="0" distL="0" distR="0" wp14:anchorId="3928DEC2" wp14:editId="10647910">
+          <wp:inline distT="0" distB="0" distL="0" distR="0" wp14:anchorId="3928DEC2" wp14:editId="7B188101">
             <wp:extent cx="5400040" cy="3096023"/>
             <wp:effectExtent l="0" t="0" r="0" b="9525"/>
             <wp:docPr id="5" name="Picture 5"/>
@@ -3766,7 +3777,7 @@
           <w:szCs w:val="22"/>
         </w:rPr>
         <w:drawing>
-          <wp:inline distT="0" distB="0" distL="0" distR="0" wp14:anchorId="5A8B8437" wp14:editId="024AF34D">
+          <wp:inline distT="0" distB="0" distL="0" distR="0" wp14:anchorId="5A8B8437" wp14:editId="775B0D41">
             <wp:extent cx="5400040" cy="3080385"/>
             <wp:effectExtent l="0" t="0" r="0" b="5715"/>
             <wp:docPr id="1418971832" name="Picture 2"/>
@@ -4441,7 +4452,7 @@
           <w:szCs w:val="22"/>
         </w:rPr>
         <w:drawing>
-          <wp:inline distT="0" distB="0" distL="0" distR="0" wp14:anchorId="62019777" wp14:editId="5131E5D5">
+          <wp:inline distT="0" distB="0" distL="0" distR="0" wp14:anchorId="62019777" wp14:editId="6269291C">
             <wp:extent cx="5400040" cy="3096023"/>
             <wp:effectExtent l="0" t="0" r="0" b="9525"/>
             <wp:docPr id="6" name="Picture 6"/>
@@ -4605,7 +4616,7 @@
           <w:szCs w:val="22"/>
         </w:rPr>
         <w:drawing>
-          <wp:inline distT="0" distB="0" distL="0" distR="0" wp14:anchorId="4FA9BB04" wp14:editId="4E84A16E">
+          <wp:inline distT="0" distB="0" distL="0" distR="0" wp14:anchorId="4FA9BB04" wp14:editId="480AD3B9">
             <wp:extent cx="5400040" cy="3096023"/>
             <wp:effectExtent l="0" t="0" r="0" b="9525"/>
             <wp:docPr id="7" name="Picture 7"/>
@@ -5411,7 +5422,7 @@
           <w:szCs w:val="22"/>
         </w:rPr>
         <w:drawing>
-          <wp:inline distT="0" distB="0" distL="0" distR="0" wp14:anchorId="29E8740D" wp14:editId="661F0160">
+          <wp:inline distT="0" distB="0" distL="0" distR="0" wp14:anchorId="29E8740D" wp14:editId="233F2212">
             <wp:extent cx="5400040" cy="3080385"/>
             <wp:effectExtent l="0" t="0" r="0" b="5715"/>
             <wp:docPr id="1377328711" name="Picture 3"/>
@@ -5560,7 +5571,7 @@
           <w:szCs w:val="22"/>
         </w:rPr>
         <w:drawing>
-          <wp:inline distT="0" distB="0" distL="0" distR="0" wp14:anchorId="2F3DD950" wp14:editId="4DA5A104">
+          <wp:inline distT="0" distB="0" distL="0" distR="0" wp14:anchorId="2F3DD950" wp14:editId="22654CC7">
             <wp:extent cx="5400040" cy="3080385"/>
             <wp:effectExtent l="0" t="0" r="0" b="5715"/>
             <wp:docPr id="1982756195" name="Picture 5"/>
@@ -5637,7 +5648,7 @@
           <w:szCs w:val="22"/>
         </w:rPr>
         <w:drawing>
-          <wp:inline distT="0" distB="0" distL="0" distR="0" wp14:anchorId="47D248BF" wp14:editId="3FEBA1A9">
+          <wp:inline distT="0" distB="0" distL="0" distR="0" wp14:anchorId="47D248BF" wp14:editId="6970AB37">
             <wp:extent cx="5400040" cy="3080385"/>
             <wp:effectExtent l="0" t="0" r="0" b="5715"/>
             <wp:docPr id="1838927744" name="Picture 4"/>
@@ -5865,7 +5876,7 @@
           <w:szCs w:val="22"/>
         </w:rPr>
         <w:drawing>
-          <wp:inline distT="0" distB="0" distL="0" distR="0" wp14:anchorId="6C16A1D3" wp14:editId="64FC58E8">
+          <wp:inline distT="0" distB="0" distL="0" distR="0" wp14:anchorId="6C16A1D3" wp14:editId="0E839826">
             <wp:extent cx="5400040" cy="3080385"/>
             <wp:effectExtent l="0" t="0" r="0" b="5715"/>
             <wp:docPr id="689049431" name="Picture 6"/>
@@ -6699,7 +6710,7 @@
           <w:szCs w:val="22"/>
         </w:rPr>
         <w:drawing>
-          <wp:inline distT="0" distB="0" distL="0" distR="0" wp14:anchorId="447B0EFC" wp14:editId="53EDCDC8">
+          <wp:inline distT="0" distB="0" distL="0" distR="0" wp14:anchorId="447B0EFC" wp14:editId="71A62919">
             <wp:extent cx="5400040" cy="3080385"/>
             <wp:effectExtent l="0" t="0" r="0" b="5715"/>
             <wp:docPr id="508580930" name="Picture 7"/>
@@ -6938,7 +6949,7 @@
           <w:szCs w:val="22"/>
         </w:rPr>
         <w:drawing>
-          <wp:inline distT="0" distB="0" distL="0" distR="0" wp14:anchorId="28D095EC" wp14:editId="3AE08F7F">
+          <wp:inline distT="0" distB="0" distL="0" distR="0" wp14:anchorId="28D095EC" wp14:editId="5559D0A5">
             <wp:extent cx="5400040" cy="3096023"/>
             <wp:effectExtent l="0" t="0" r="0" b="9525"/>
             <wp:docPr id="12" name="Picture 12"/>
@@ -7029,7 +7040,7 @@
           <w:szCs w:val="22"/>
         </w:rPr>
         <w:drawing>
-          <wp:inline distT="0" distB="0" distL="0" distR="0" wp14:anchorId="4F4BD929" wp14:editId="23381DEB">
+          <wp:inline distT="0" distB="0" distL="0" distR="0" wp14:anchorId="4F4BD929" wp14:editId="2B43712F">
             <wp:extent cx="5400040" cy="3080385"/>
             <wp:effectExtent l="0" t="0" r="0" b="5715"/>
             <wp:docPr id="795974083" name="Picture 8"/>
@@ -7301,7 +7312,7 @@
           <w:szCs w:val="22"/>
         </w:rPr>
         <w:drawing>
-          <wp:inline distT="0" distB="0" distL="0" distR="0" wp14:anchorId="77C3BC85" wp14:editId="512F6B67">
+          <wp:inline distT="0" distB="0" distL="0" distR="0" wp14:anchorId="77C3BC85" wp14:editId="2D5B867F">
             <wp:extent cx="5400040" cy="3080385"/>
             <wp:effectExtent l="0" t="0" r="0" b="5715"/>
             <wp:docPr id="1623573134" name="Picture 9"/>
@@ -7621,7 +7632,7 @@
           <w:szCs w:val="22"/>
         </w:rPr>
         <w:drawing>
-          <wp:inline distT="0" distB="0" distL="0" distR="0" wp14:anchorId="3C854328" wp14:editId="4A8E53BE">
+          <wp:inline distT="0" distB="0" distL="0" distR="0" wp14:anchorId="3C854328" wp14:editId="2C860ADD">
             <wp:extent cx="5400040" cy="3080385"/>
             <wp:effectExtent l="0" t="0" r="0" b="5715"/>
             <wp:docPr id="2146441674" name="Picture 10"/>
@@ -7925,7 +7936,7 @@
           <w:szCs w:val="22"/>
         </w:rPr>
         <w:drawing>
-          <wp:inline distT="0" distB="0" distL="0" distR="0" wp14:anchorId="55A5B2F5" wp14:editId="385907D5">
+          <wp:inline distT="0" distB="0" distL="0" distR="0" wp14:anchorId="55A5B2F5" wp14:editId="5C8319EA">
             <wp:extent cx="5400040" cy="3096023"/>
             <wp:effectExtent l="0" t="0" r="0" b="9525"/>
             <wp:docPr id="13" name="Picture 13"/>
@@ -8016,7 +8027,7 @@
           <w:szCs w:val="22"/>
         </w:rPr>
         <w:drawing>
-          <wp:inline distT="0" distB="0" distL="0" distR="0" wp14:anchorId="60B5FCC5" wp14:editId="01691BB8">
+          <wp:inline distT="0" distB="0" distL="0" distR="0" wp14:anchorId="60B5FCC5" wp14:editId="5F1FA829">
             <wp:extent cx="5400040" cy="3080385"/>
             <wp:effectExtent l="0" t="0" r="0" b="5715"/>
             <wp:docPr id="922087611" name="Picture 11"/>
@@ -8251,7 +8262,7 @@
           <w:szCs w:val="22"/>
         </w:rPr>
         <w:drawing>
-          <wp:inline distT="0" distB="0" distL="0" distR="0" wp14:anchorId="79ECD8B4" wp14:editId="60679918">
+          <wp:inline distT="0" distB="0" distL="0" distR="0" wp14:anchorId="79ECD8B4" wp14:editId="70FAC334">
             <wp:extent cx="5400040" cy="3080385"/>
             <wp:effectExtent l="0" t="0" r="0" b="5715"/>
             <wp:docPr id="1015674871" name="Picture 12"/>
@@ -8450,7 +8461,7 @@
           <w:szCs w:val="22"/>
         </w:rPr>
         <w:drawing>
-          <wp:inline distT="0" distB="0" distL="0" distR="0" wp14:anchorId="2FE5EC30" wp14:editId="4E02E713">
+          <wp:inline distT="0" distB="0" distL="0" distR="0" wp14:anchorId="2FE5EC30" wp14:editId="4DE54E54">
             <wp:extent cx="5400040" cy="3080385"/>
             <wp:effectExtent l="0" t="0" r="0" b="5715"/>
             <wp:docPr id="1398123986" name="Picture 14"/>
@@ -8527,7 +8538,7 @@
           <w:szCs w:val="22"/>
         </w:rPr>
         <w:drawing>
-          <wp:inline distT="0" distB="0" distL="0" distR="0" wp14:anchorId="112522E3" wp14:editId="3956B24C">
+          <wp:inline distT="0" distB="0" distL="0" distR="0" wp14:anchorId="112522E3" wp14:editId="228E732D">
             <wp:extent cx="5400040" cy="3080385"/>
             <wp:effectExtent l="0" t="0" r="0" b="5715"/>
             <wp:docPr id="691481767" name="Picture 13"/>
@@ -8664,7 +8675,7 @@
           <w:szCs w:val="22"/>
         </w:rPr>
         <w:drawing>
-          <wp:inline distT="0" distB="0" distL="0" distR="0" wp14:anchorId="39D4B959" wp14:editId="33680A0F">
+          <wp:inline distT="0" distB="0" distL="0" distR="0" wp14:anchorId="39D4B959" wp14:editId="47FBD104">
             <wp:extent cx="5400040" cy="3096023"/>
             <wp:effectExtent l="0" t="0" r="0" b="9525"/>
             <wp:docPr id="14" name="Picture 14"/>
@@ -8882,7 +8893,7 @@
           <w:szCs w:val="22"/>
         </w:rPr>
         <w:drawing>
-          <wp:inline distT="0" distB="0" distL="0" distR="0" wp14:anchorId="5CBD8D0F" wp14:editId="6B263264">
+          <wp:inline distT="0" distB="0" distL="0" distR="0" wp14:anchorId="5CBD8D0F" wp14:editId="71724632">
             <wp:extent cx="5400040" cy="3080385"/>
             <wp:effectExtent l="0" t="0" r="0" b="5715"/>
             <wp:docPr id="871129653" name="Picture 1"/>
@@ -8952,7 +8963,7 @@
           <w:szCs w:val="22"/>
         </w:rPr>
         <w:drawing>
-          <wp:inline distT="0" distB="0" distL="0" distR="0" wp14:anchorId="507F6F9B" wp14:editId="2F1C48EB">
+          <wp:inline distT="0" distB="0" distL="0" distR="0" wp14:anchorId="507F6F9B" wp14:editId="24873112">
             <wp:extent cx="5400040" cy="3096023"/>
             <wp:effectExtent l="0" t="0" r="0" b="9525"/>
             <wp:docPr id="15" name="Picture 15"/>
@@ -9370,7 +9381,7 @@
           <w:szCs w:val="22"/>
         </w:rPr>
         <w:drawing>
-          <wp:inline distT="0" distB="0" distL="0" distR="0" wp14:anchorId="6E65D49C" wp14:editId="1B3082F2">
+          <wp:inline distT="0" distB="0" distL="0" distR="0" wp14:anchorId="6E65D49C" wp14:editId="4A29113D">
             <wp:extent cx="5400040" cy="3096023"/>
             <wp:effectExtent l="0" t="0" r="0" b="9525"/>
             <wp:docPr id="16" name="Picture 16"/>

</xml_diff>